<commit_message>
iasb adversary-complaint, motion-brief: typst and docx on the shared cross-engine layout model; docx/make-reference.sh and reference.docx give way to docx/reference.xml (base="xengine", Times New Roman, was EB Garamond); the tables built from the markdown in both engines with the same column sums, '. . .' bound with no-break spaces; complaint docx XENG-001..003 pass (149/149 lines), params.cross_engine: gate; motion XENG-001/002 pass, XENG-003 289/290 (footnote 2 splits 4+2 in typst, 5+1 in LibreOffice, which ignores widow control in a note), cross_engine: report (fb-595.68.7)
</commit_message>
<xml_diff>
--- a/courts/eighth-circuit/iowa/federal/bankruptcy-southern-district/adversary-complaint/usage/OUTPUT-adversary-complaint.docx
+++ b/courts/eighth-circuit/iowa/federal/bankruptcy-southern-district/adversary-complaint/usage/OUTPUT-adversary-complaint.docx
@@ -4,38 +4,48 @@
   <w:body>
     <w:p>
       <w:pPr>
-        <w:pStyle w:val="CourtName"/>
-      </w:pPr>
-      <w:r>
+        <w:spacing w:before="0" w:after="0" w:line="280" w:lineRule="exact"/>
+        <w:ind w:left="0" w:firstLine="0"/>
+        <w:jc w:val="center"/>
+      </w:pPr>
+      <w:r>
+        <w:rPr>
+          <w:b/>
+          <w:bCs/>
+        </w:rPr>
         <w:t xml:space="preserve">UNITED STATES BANKRUPTCY COURT</w:t>
       </w:r>
     </w:p>
     <w:p>
       <w:pPr>
-        <w:pStyle w:val="CourtName"/>
-        <w:spacing w:before="0" w:after="360" w:line="240" w:lineRule="auto"/>
-      </w:pPr>
-      <w:r>
+        <w:spacing w:before="0" w:after="0" w:line="280" w:lineRule="exact"/>
+        <w:ind w:left="0" w:firstLine="0"/>
+        <w:jc w:val="center"/>
+      </w:pPr>
+      <w:r>
+        <w:rPr>
+          <w:b/>
+          <w:bCs/>
+        </w:rPr>
         <w:t xml:space="preserve">SOUTHERN DISTRICT OF IOWA</w:t>
       </w:r>
+    </w:p>
+    <w:p>
+      <w:pPr>
+        <w:spacing w:before="0" w:after="0" w:line="480" w:lineRule="exact"/>
+      </w:pPr>
     </w:p>
     <w:tbl>
       <w:tblPr>
         <w:tblW w:w="9360" w:type="dxa"/>
-        <w:tblBorders>
-          <w:top w:val="nil"/>
-          <w:left w:val="nil"/>
-          <w:bottom w:val="nil"/>
-          <w:right w:val="nil"/>
-          <w:insideH w:val="nil"/>
-          <w:insideV w:val="nil"/>
-        </w:tblBorders>
         <w:tblLayout w:type="fixed"/>
         <w:tblCellMar>
+          <w:top w:w="0" w:type="dxa"/>
           <w:left w:w="0" w:type="dxa"/>
+          <w:bottom w:w="0" w:type="dxa"/>
           <w:right w:w="0" w:type="dxa"/>
         </w:tblCellMar>
-        <w:tblLook w:val="0000"/>
+        <w:tblLook w:val="0000" w:firstRow="0" w:lastRow="0" w:firstColumn="0" w:lastColumn="0" w:noHBand="0" w:noVBand="0"/>
       </w:tblPr>
       <w:tblGrid>
         <w:gridCol w:w="4896"/>
@@ -60,8 +70,9 @@
           </w:tcPr>
           <w:p>
             <w:pPr>
-              <w:pStyle w:val="SingleSpaced"/>
-              <w:spacing w:before="0" w:after="120" w:line="240" w:lineRule="auto"/>
+              <w:spacing w:before="0" w:after="0" w:line="280" w:lineRule="exact"/>
+              <w:ind w:left="0" w:firstLine="0"/>
+              <w:jc w:val="left"/>
             </w:pPr>
             <w:r>
               <w:t xml:space="preserve">In re:</w:t>
@@ -69,17 +80,43 @@
           </w:p>
           <w:p>
             <w:pPr>
-              <w:pStyle w:val="SingleSpaced"/>
-              <w:spacing w:before="0" w:after="120" w:line="240" w:lineRule="auto"/>
-            </w:pPr>
-            <w:r>
-              <w:t xml:space="preserve">LINDSAY STURM and SEAN STURM</w:t>
-            </w:r>
-          </w:p>
-          <w:p>
-            <w:pPr>
-              <w:pStyle w:val="SingleSpaced"/>
-              <w:spacing w:before="0" w:after="240" w:line="240" w:lineRule="auto"/>
+              <w:spacing w:before="0" w:after="0" w:line="280" w:lineRule="exact"/>
+              <w:ind w:left="0" w:firstLine="0"/>
+              <w:jc w:val="left"/>
+            </w:pPr>
+            <w:r>
+              <w:t xml:space="preserve">LINDSAY</w:t>
+            </w:r>
+            <w:r>
+              <w:t xml:space="preserve"> </w:t>
+            </w:r>
+            <w:r>
+              <w:t xml:space="preserve">STURM</w:t>
+            </w:r>
+            <w:r>
+              <w:t xml:space="preserve"> </w:t>
+            </w:r>
+            <w:r>
+              <w:t xml:space="preserve">and</w:t>
+            </w:r>
+            <w:r>
+              <w:t xml:space="preserve"> </w:t>
+            </w:r>
+            <w:r>
+              <w:t xml:space="preserve">SEAN</w:t>
+            </w:r>
+            <w:r>
+              <w:t xml:space="preserve"> </w:t>
+            </w:r>
+            <w:r>
+              <w:t xml:space="preserve">STURM</w:t>
+            </w:r>
+          </w:p>
+          <w:p>
+            <w:pPr>
+              <w:spacing w:before="0" w:after="0" w:line="280" w:lineRule="exact"/>
+              <w:ind w:left="0" w:firstLine="0"/>
+              <w:jc w:val="left"/>
             </w:pPr>
             <w:r>
               <w:t xml:space="preserve">Debtor.</w:t>
@@ -87,17 +124,43 @@
           </w:p>
           <w:p>
             <w:pPr>
-              <w:pStyle w:val="SingleSpaced"/>
-              <w:spacing w:before="0" w:after="120" w:line="240" w:lineRule="auto"/>
-            </w:pPr>
-            <w:r>
-              <w:t xml:space="preserve">SOUTH STORY BANK &amp; TRUST</w:t>
-            </w:r>
-          </w:p>
-          <w:p>
-            <w:pPr>
-              <w:pStyle w:val="SingleSpaced"/>
-              <w:spacing w:before="0" w:after="240" w:line="240" w:lineRule="auto"/>
+              <w:spacing w:before="120" w:after="0" w:line="280" w:lineRule="exact"/>
+              <w:ind w:left="0" w:firstLine="0"/>
+              <w:jc w:val="left"/>
+            </w:pPr>
+            <w:r>
+              <w:t xml:space="preserve">SOUTH</w:t>
+            </w:r>
+            <w:r>
+              <w:t xml:space="preserve"> </w:t>
+            </w:r>
+            <w:r>
+              <w:t xml:space="preserve">STORY</w:t>
+            </w:r>
+            <w:r>
+              <w:t xml:space="preserve"> </w:t>
+            </w:r>
+            <w:r>
+              <w:t xml:space="preserve">BANK</w:t>
+            </w:r>
+            <w:r>
+              <w:t xml:space="preserve"> </w:t>
+            </w:r>
+            <w:r>
+              <w:t xml:space="preserve">&amp;</w:t>
+            </w:r>
+            <w:r>
+              <w:t xml:space="preserve"> </w:t>
+            </w:r>
+            <w:r>
+              <w:t xml:space="preserve">TRUST</w:t>
+            </w:r>
+          </w:p>
+          <w:p>
+            <w:pPr>
+              <w:spacing w:before="0" w:after="0" w:line="280" w:lineRule="exact"/>
+              <w:ind w:left="0" w:firstLine="0"/>
+              <w:jc w:val="left"/>
             </w:pPr>
             <w:r>
               <w:t xml:space="preserve">Plaintiff,</w:t>
@@ -105,8 +168,9 @@
           </w:p>
           <w:p>
             <w:pPr>
-              <w:pStyle w:val="SingleSpaced"/>
-              <w:spacing w:before="0" w:after="240" w:line="240" w:lineRule="auto"/>
+              <w:spacing w:before="120" w:after="0" w:line="280" w:lineRule="exact"/>
+              <w:ind w:left="0" w:firstLine="0"/>
+              <w:jc w:val="left"/>
             </w:pPr>
             <w:r>
               <w:t xml:space="preserve">v.</w:t>
@@ -114,17 +178,43 @@
           </w:p>
           <w:p>
             <w:pPr>
-              <w:pStyle w:val="SingleSpaced"/>
-              <w:spacing w:before="0" w:after="120" w:line="240" w:lineRule="auto"/>
-            </w:pPr>
-            <w:r>
-              <w:t xml:space="preserve">LINDSAY STURM and SEAN STURM</w:t>
-            </w:r>
-          </w:p>
-          <w:p>
-            <w:pPr>
-              <w:pStyle w:val="SingleSpaced"/>
-              <w:spacing w:before="0" w:after="0" w:line="240" w:lineRule="auto"/>
+              <w:spacing w:before="120" w:after="0" w:line="280" w:lineRule="exact"/>
+              <w:ind w:left="0" w:firstLine="0"/>
+              <w:jc w:val="left"/>
+            </w:pPr>
+            <w:r>
+              <w:t xml:space="preserve">LINDSAY</w:t>
+            </w:r>
+            <w:r>
+              <w:t xml:space="preserve"> </w:t>
+            </w:r>
+            <w:r>
+              <w:t xml:space="preserve">STURM</w:t>
+            </w:r>
+            <w:r>
+              <w:t xml:space="preserve"> </w:t>
+            </w:r>
+            <w:r>
+              <w:t xml:space="preserve">and</w:t>
+            </w:r>
+            <w:r>
+              <w:t xml:space="preserve"> </w:t>
+            </w:r>
+            <w:r>
+              <w:t xml:space="preserve">SEAN</w:t>
+            </w:r>
+            <w:r>
+              <w:t xml:space="preserve"> </w:t>
+            </w:r>
+            <w:r>
+              <w:t xml:space="preserve">STURM</w:t>
+            </w:r>
+          </w:p>
+          <w:p>
+            <w:pPr>
+              <w:spacing w:before="0" w:after="0" w:line="280" w:lineRule="exact"/>
+              <w:ind w:left="0" w:firstLine="0"/>
+              <w:jc w:val="left"/>
             </w:pPr>
             <w:r>
               <w:t xml:space="preserve">Defendants.</w:t>
@@ -137,29 +227,36 @@
           </w:tcPr>
           <w:p>
             <w:pPr>
-              <w:pStyle w:val="SingleSpaced"/>
+              <w:spacing w:before="0" w:after="0" w:line="280" w:lineRule="exact"/>
+              <w:ind w:left="0" w:firstLine="0"/>
+              <w:jc w:val="left"/>
             </w:pPr>
           </w:p>
         </w:tc>
         <w:tc>
           <w:tcPr>
             <w:tcW w:w="4104" w:type="dxa"/>
-          </w:tcPr>
-          <w:p>
-            <w:pPr>
-              <w:pStyle w:val="SingleSpaced"/>
-              <w:spacing w:before="0" w:after="120" w:line="240" w:lineRule="auto"/>
-              <w:ind w:left="144"/>
-            </w:pPr>
-            <w:r>
-              <w:t xml:space="preserve">Case No. 25-01022-lmj7</w:t>
-            </w:r>
-          </w:p>
-          <w:p>
-            <w:pPr>
-              <w:pStyle w:val="SingleSpaced"/>
-              <w:spacing w:before="0" w:after="120" w:line="240" w:lineRule="auto"/>
-              <w:ind w:left="144"/>
+            <w:tcMar>
+              <w:left w:w="144" w:type="dxa"/>
+            </w:tcMar>
+          </w:tcPr>
+          <w:p>
+            <w:pPr>
+              <w:spacing w:before="0" w:after="0" w:line="280" w:lineRule="exact"/>
+              <w:ind w:left="0" w:firstLine="0"/>
+              <w:jc w:val="left"/>
+            </w:pPr>
+            <w:r>
+              <w:t xml:space="preserve">Case No. 25</w:t>
+              <w:noBreakHyphen/>
+              <w:t xml:space="preserve">01022-lmj7</w:t>
+            </w:r>
+          </w:p>
+          <w:p>
+            <w:pPr>
+              <w:spacing w:before="0" w:after="0" w:line="280" w:lineRule="exact"/>
+              <w:ind w:left="0" w:firstLine="0"/>
+              <w:jc w:val="left"/>
             </w:pPr>
             <w:r>
               <w:t xml:space="preserve">Chapter 7</w:t>
@@ -167,8 +264,9 @@
           </w:p>
           <w:p>
             <w:pPr>
-              <w:pStyle w:val="SingleSpaced"/>
-              <w:ind w:left="144"/>
+              <w:spacing w:before="0" w:after="0" w:line="280" w:lineRule="exact"/>
+              <w:ind w:left="0" w:firstLine="0"/>
+              <w:jc w:val="left"/>
             </w:pPr>
             <w:r>
               <w:t xml:space="preserve">Adv. Proc. No. ______________</w:t>
@@ -179,28 +277,92 @@
     </w:tbl>
     <w:p>
       <w:pPr>
+        <w:spacing w:before="480" w:after="360" w:line="280" w:lineRule="exact"/>
+        <w:ind w:left="0" w:firstLine="0"/>
+        <w:jc w:val="center"/>
+      </w:pPr>
+      <w:r>
+        <w:rPr>
+          <w:b/>
+          <w:bCs/>
+        </w:rPr>
+        <w:t xml:space="preserve">COMPLAINT</w:t>
+      </w:r>
+      <w:r>
+        <w:rPr>
+          <w:b/>
+          <w:bCs/>
+        </w:rPr>
+        <w:t xml:space="preserve"> </w:t>
+      </w:r>
+      <w:r>
+        <w:rPr>
+          <w:b/>
+          <w:bCs/>
+        </w:rPr>
+        <w:t xml:space="preserve">OBJECTING</w:t>
+      </w:r>
+      <w:r>
+        <w:rPr>
+          <w:b/>
+          <w:bCs/>
+        </w:rPr>
+        <w:t xml:space="preserve"> </w:t>
+      </w:r>
+      <w:r>
+        <w:rPr>
+          <w:b/>
+          <w:bCs/>
+        </w:rPr>
+        <w:t xml:space="preserve">TO</w:t>
+      </w:r>
+      <w:r>
+        <w:rPr>
+          <w:b/>
+          <w:bCs/>
+        </w:rPr>
+        <w:t xml:space="preserve"> </w:t>
+      </w:r>
+      <w:r>
+        <w:rPr>
+          <w:b/>
+          <w:bCs/>
+        </w:rPr>
+        <w:t xml:space="preserve">DISCHARGEABILITY</w:t>
+      </w:r>
+      <w:r>
+        <w:rPr>
+          <w:b/>
+          <w:bCs/>
+        </w:rPr>
+        <w:t xml:space="preserve"> </w:t>
+      </w:r>
+      <w:r>
+        <w:rPr>
+          <w:b/>
+          <w:bCs/>
+        </w:rPr>
+        <w:t xml:space="preserve">OF</w:t>
+      </w:r>
+      <w:r>
+        <w:rPr>
+          <w:b/>
+          <w:bCs/>
+        </w:rPr>
+        <w:t xml:space="preserve"> </w:t>
+      </w:r>
+      <w:r>
+        <w:rPr>
+          <w:b/>
+          <w:bCs/>
+        </w:rPr>
+        <w:t xml:space="preserve">DEBT</w:t>
+      </w:r>
+    </w:p>
+    <w:p>
+      <w:pPr>
         <w:pStyle w:val="BodyText"/>
       </w:pPr>
-    </w:p>
-    <w:p>
-      <w:pPr>
-        <w:pStyle w:val="SingleSpaced"/>
-        <w:spacing w:before="0" w:after="0" w:line="240" w:lineRule="auto"/>
-        <w:jc w:val="center"/>
-      </w:pPr>
-      <w:r>
-        <w:t xml:space="preserve">COMPLAINT OBJECTING TO DISCHARGEABILITY OF DEBT</w:t>
-      </w:r>
-    </w:p>
-    <w:p>
-      <w:pPr>
-        <w:pStyle w:val="BodyText"/>
-      </w:pPr>
-    </w:p>
-    <w:p>
-      <w:pPr>
-        <w:pStyle w:val="IndentedParagraph"/>
-      </w:pPr>
       <w:r>
         <w:t xml:space="preserve">COMES NOW South Story Bank &amp; Trust (</w:t>
       </w:r>
@@ -222,7 +384,13 @@
         <w:tab/>
       </w:r>
       <w:r>
-        <w:t xml:space="preserve">This adversary proceeding arises in and relates to the Chapter 7 case of LINDSAY STURM and SEAN STURM, Case No. 25-01022-lmj7, pending in the United States Bankruptcy Court for the Southern District of Iowa, Central Division.</w:t>
+        <w:t xml:space="preserve">This adversary proceeding arises in and relates to the Chapter 7 case of LINDSAY STURM and SEAN STURM, Case No. 25</w:t>
+      </w:r>
+      <w:r>
+        <w:noBreakHyphen/>
+      </w:r>
+      <w:r>
+        <w:t xml:space="preserve">01022-lmj7, pending in the United States Bankruptcy Court for the Southern District of Iowa, Central Division.</w:t>
       </w:r>
     </w:p>
     <w:p>
@@ -306,7 +474,7 @@
         <w:tab/>
       </w:r>
       <w:r>
-        <w:t xml:space="preserve">This Court has subject matter jurisdiction in this Complaint pursuant to 28 U.S.C. § 1334. This Court’s subject matter jurisdiction is further augmented by a General Reference Order issued by the United States District Court.</w:t>
+        <w:t xml:space="preserve">This Court has subject matter jurisdiction in this Complaint pursuant to 28 U.S.C. § 1334. This Court’s subject matter jurisdiction is further augmented by a General Reference Order issued by the United States District Court.</w:t>
       </w:r>
     </w:p>
     <w:p>
@@ -320,7 +488,7 @@
         <w:tab/>
       </w:r>
       <w:r>
-        <w:t xml:space="preserve">Venue of this Complaint is proper in this Court by operation of 28 U.S.C. § 1409(a).</w:t>
+        <w:t xml:space="preserve">Venue of this Complaint is proper in this Court by operation of 28 U.S.C. § 1409(a).</w:t>
       </w:r>
     </w:p>
     <w:p>
@@ -334,7 +502,7 @@
         <w:tab/>
       </w:r>
       <w:r>
-        <w:t xml:space="preserve">This is a core proceeding by operation of 28 U.S.C. § 157(b)(2)(I).</w:t>
+        <w:t xml:space="preserve">This is a core proceeding by operation of 28 U.S.C. § 157(b)⁠(2)⁠(I).</w:t>
       </w:r>
     </w:p>
     <w:p>
@@ -402,7 +570,7 @@
         <w:pStyle w:val="BlockText"/>
       </w:pPr>
       <w:r>
-        <w:t xml:space="preserve">“Except for inventory sold or accounts collected in the ordinary course of Grantor’s business, or as otherwise provided for in this Agreement, Grantor shall not sell, or otherwise transfer or dispose of the Collateral. . . Unless waived by Lender, all proceeds from any disposition of the Collateral (for whatever reason) shall be held in trust for Lender and shall not be comingled with any other funds; provided however, this requirement shall not constitute consent by Lender to any sale or other disposition. Upon receipt, Grantor shall immediately deliver any such proceeds to Lender.”</w:t>
+        <w:t xml:space="preserve">“Except for inventory sold or accounts collected in the ordinary course of Grantor’s business, or as otherwise provided for in this Agreement, Grantor shall not sell, or otherwise transfer or dispose of the Collateral. . . Unless waived by Lender, all proceeds from any disposition of the Collateral (for whatever reason) shall be held in trust for Lender and shall not be comingled with any other funds; provided however, this requirement shall not constitute consent by Lender to any sale or other disposition. Upon receipt, Grantor shall immediately deliver any such proceeds to Lender.”</w:t>
       </w:r>
     </w:p>
     <w:p>
@@ -456,28 +624,58 @@
         <w:tab/>
       </w:r>
       <w:r>
-        <w:t xml:space="preserve">On August 4, 2022, SCS and Plaintiff executed a Change In Terms Agreement (CIT-1), a copy of which is attached hereto as Exhibit F, wherein the maximum credit available to SCS under the Note was increased from $1,150,000.00 to $1,435,000.00 and the maturity date was extended from September 2, 2022 to December 3, 2022. On December 20, 2022, SCS and Plaintiff executed a Change In Terms Agreement (</w:t>
-      </w:r>
-      <w:r>
-        <w:t xml:space="preserve">“CIT-2”</w:t>
+        <w:t xml:space="preserve">On August 4, 2022, SCS and Plaintiff executed a Change In Terms Agreement (CIT</w:t>
+      </w:r>
+      <w:r>
+        <w:noBreakHyphen/>
+      </w:r>
+      <w:r>
+        <w:t xml:space="preserve">1), a copy of which is attached hereto as Exhibit F, wherein the maximum credit available to SCS under the Note was increased from $1,150,000.00 to $1,435,000.00 and the maturity date was extended from September 2, 2022 to December 3, 2022. On December 20, 2022, SCS and Plaintiff executed a Change In Terms Agreement (</w:t>
+      </w:r>
+      <w:r>
+        <w:t xml:space="preserve">“CIT</w:t>
+      </w:r>
+      <w:r>
+        <w:noBreakHyphen/>
+      </w:r>
+      <w:r>
+        <w:t xml:space="preserve">2”</w:t>
       </w:r>
       <w:r>
         <w:t xml:space="preserve">), a copy of which is attached hereto as Exhibit G, wherein the maturity date was extended from December 3, 2022 to February 3, 2023. On March 3, 2023, SCS and Plaintiff executed a Change In Terms Agreement (</w:t>
       </w:r>
       <w:r>
-        <w:t xml:space="preserve">“CIT-3”</w:t>
+        <w:t xml:space="preserve">“CIT</w:t>
+      </w:r>
+      <w:r>
+        <w:noBreakHyphen/>
+      </w:r>
+      <w:r>
+        <w:t xml:space="preserve">3”</w:t>
       </w:r>
       <w:r>
         <w:t xml:space="preserve">), a copy of which is attached hereto as Exhibit H, wherein the maturity date was extended from February 3, 2023 to May 3, 2023. On June 28, 2023, SCS and Plaintiff executed a Change In Terms Agreement (</w:t>
       </w:r>
       <w:r>
-        <w:t xml:space="preserve">“CIT-4”</w:t>
+        <w:t xml:space="preserve">“CIT</w:t>
+      </w:r>
+      <w:r>
+        <w:noBreakHyphen/>
+      </w:r>
+      <w:r>
+        <w:t xml:space="preserve">4”</w:t>
       </w:r>
       <w:r>
         <w:t xml:space="preserve">), a copy of which is attached hereto as Exhibit I, wherein the maturity date was extended from May 3, 2023 to August 3, 2023. On August 10, 2023, SCS and Plaintiff executed a Change In Terms Agreement (</w:t>
       </w:r>
       <w:r>
-        <w:t xml:space="preserve">“CIT-5”</w:t>
+        <w:t xml:space="preserve">“CIT</w:t>
+      </w:r>
+      <w:r>
+        <w:noBreakHyphen/>
+      </w:r>
+      <w:r>
+        <w:t xml:space="preserve">5”</w:t>
       </w:r>
       <w:r>
         <w:t xml:space="preserve">), a copy of which is attached hereto as Exhibit J, wherein the maturity date was extended from August 3, 2023 to August 3, 2030.</w:t>
@@ -558,27 +756,53 @@
       <w:r>
         <w:t xml:space="preserve">Notwithstanding the mandate in the Security Agreement prohibiting the sale of Plaintiff’s collateral outside of SCS’s ordinary course of business, and the requirement that the proceeds of any such collateral sold be immediately turned over to Plaintiff, which mandate and requirement were reiterated in Plaintiff’s letters to SCS and Guarantors dated March 25, 2025 (Exhibit L) and April 24, 2024 (Exhibit M), SCS and Guarantors have admitted, through their attorney’s letter dated July 25, 2025, a copy of which is attached hereto as Exhibit N, that the following collateralized items were sold and the proceeds were given to other parties:</w:t>
       </w:r>
+    </w:p>
+    <w:p>
+      <w:pPr>
+        <w:spacing w:before="0" w:after="0" w:line="120" w:lineRule="exact"/>
+      </w:pPr>
     </w:p>
     <w:tbl>
       <w:tblPr>
-        <w:tblStyle w:val="Table"/>
-        <w:tblW w:type="auto" w:w="0"/>
-        <w:tblLook w:firstRow="1" w:lastRow="0" w:firstColumn="0" w:lastColumn="0" w:noHBand="0" w:noVBand="0" w:val="0020"/>
+        <w:tblW w:w="8640" w:type="dxa"/>
+        <w:tblInd w:w="720" w:type="dxa"/>
+        <w:tblBorders>
+          <w:top w:val="single" w:sz="4" w:space="0" w:color="000000"/>
+          <w:left w:val="single" w:sz="4" w:space="0" w:color="000000"/>
+          <w:bottom w:val="single" w:sz="4" w:space="0" w:color="000000"/>
+          <w:right w:val="single" w:sz="4" w:space="0" w:color="000000"/>
+          <w:insideH w:val="single" w:sz="4" w:space="0" w:color="000000"/>
+          <w:insideV w:val="single" w:sz="4" w:space="0" w:color="000000"/>
+        </w:tblBorders>
+        <w:tblLayout w:type="fixed"/>
+        <w:tblCellMar>
+          <w:top w:w="0" w:type="dxa"/>
+          <w:left w:w="108" w:type="dxa"/>
+          <w:bottom w:w="0" w:type="dxa"/>
+          <w:right w:w="108" w:type="dxa"/>
+        </w:tblCellMar>
+        <w:tblLook w:val="0000" w:firstRow="0" w:lastRow="0" w:firstColumn="0" w:lastColumn="0" w:noHBand="0" w:noVBand="0"/>
       </w:tblPr>
       <w:tblGrid>
-        <w:gridCol w:w="2640"/>
-        <w:gridCol w:w="2640"/>
-        <w:gridCol w:w="2640"/>
+        <w:gridCol w:w="1531"/>
+        <w:gridCol w:w="5578"/>
+        <w:gridCol w:w="1531"/>
       </w:tblGrid>
       <w:tr>
         <w:trPr>
-          <w:tblHeader w:val="on"/>
+          <w:cantSplit/>
         </w:trPr>
         <w:tc>
-          <w:tcPr/>
-          <w:p>
-            <w:pPr>
-              <w:pStyle w:val="Compact"/>
+          <w:tcPr>
+            <w:tcW w:w="1531" w:type="dxa"/>
+          </w:tcPr>
+          <w:p>
+            <w:pPr>
+              <w:keepNext/>
+              <w:keepLines/>
+              <w:spacing w:before="0" w:after="0" w:line="280" w:lineRule="exact"/>
+              <w:ind w:left="0" w:firstLine="0"/>
+              <w:jc w:val="left"/>
             </w:pPr>
             <w:r>
               <w:t xml:space="preserve">Date</w:t>
@@ -586,10 +810,16 @@
           </w:p>
         </w:tc>
         <w:tc>
-          <w:tcPr/>
-          <w:p>
-            <w:pPr>
-              <w:pStyle w:val="Compact"/>
+          <w:tcPr>
+            <w:tcW w:w="5578" w:type="dxa"/>
+          </w:tcPr>
+          <w:p>
+            <w:pPr>
+              <w:keepNext/>
+              <w:keepLines/>
+              <w:spacing w:before="0" w:after="0" w:line="280" w:lineRule="exact"/>
+              <w:ind w:left="0" w:firstLine="0"/>
+              <w:jc w:val="left"/>
             </w:pPr>
             <w:r>
               <w:t xml:space="preserve">Item</w:t>
@@ -597,10 +827,16 @@
           </w:p>
         </w:tc>
         <w:tc>
-          <w:tcPr/>
-          <w:p>
-            <w:pPr>
-              <w:pStyle w:val="Compact"/>
+          <w:tcPr>
+            <w:tcW w:w="1531" w:type="dxa"/>
+          </w:tcPr>
+          <w:p>
+            <w:pPr>
+              <w:keepNext/>
+              <w:keepLines/>
+              <w:spacing w:before="0" w:after="0" w:line="280" w:lineRule="exact"/>
+              <w:ind w:left="0" w:firstLine="0"/>
+              <w:jc w:val="left"/>
             </w:pPr>
             <w:r>
               <w:t xml:space="preserve">Amount</w:t>
@@ -609,11 +845,20 @@
         </w:tc>
       </w:tr>
       <w:tr>
-        <w:tc>
-          <w:tcPr/>
-          <w:p>
-            <w:pPr>
-              <w:pStyle w:val="Compact"/>
+        <w:trPr>
+          <w:cantSplit/>
+        </w:trPr>
+        <w:tc>
+          <w:tcPr>
+            <w:tcW w:w="1531" w:type="dxa"/>
+          </w:tcPr>
+          <w:p>
+            <w:pPr>
+              <w:keepNext/>
+              <w:keepLines/>
+              <w:spacing w:before="0" w:after="0" w:line="280" w:lineRule="exact"/>
+              <w:ind w:left="0" w:firstLine="0"/>
+              <w:jc w:val="left"/>
             </w:pPr>
             <w:r>
               <w:t xml:space="preserve">02/27/2025</w:t>
@@ -621,21 +866,51 @@
           </w:p>
         </w:tc>
         <w:tc>
-          <w:tcPr/>
-          <w:p>
-            <w:pPr>
-              <w:pStyle w:val="Compact"/>
-            </w:pPr>
-            <w:r>
-              <w:t xml:space="preserve">Diamond glow facial machine</w:t>
-            </w:r>
-          </w:p>
-        </w:tc>
-        <w:tc>
-          <w:tcPr/>
-          <w:p>
-            <w:pPr>
-              <w:pStyle w:val="Compact"/>
+          <w:tcPr>
+            <w:tcW w:w="5578" w:type="dxa"/>
+          </w:tcPr>
+          <w:p>
+            <w:pPr>
+              <w:keepNext/>
+              <w:keepLines/>
+              <w:spacing w:before="0" w:after="0" w:line="280" w:lineRule="exact"/>
+              <w:ind w:left="0" w:firstLine="0"/>
+              <w:jc w:val="left"/>
+            </w:pPr>
+            <w:r>
+              <w:t xml:space="preserve">Diamond</w:t>
+            </w:r>
+            <w:r>
+              <w:t xml:space="preserve"> </w:t>
+            </w:r>
+            <w:r>
+              <w:t xml:space="preserve">glow</w:t>
+            </w:r>
+            <w:r>
+              <w:t xml:space="preserve"> </w:t>
+            </w:r>
+            <w:r>
+              <w:t xml:space="preserve">facial</w:t>
+            </w:r>
+            <w:r>
+              <w:t xml:space="preserve"> </w:t>
+            </w:r>
+            <w:r>
+              <w:t xml:space="preserve">machine</w:t>
+            </w:r>
+          </w:p>
+        </w:tc>
+        <w:tc>
+          <w:tcPr>
+            <w:tcW w:w="1531" w:type="dxa"/>
+          </w:tcPr>
+          <w:p>
+            <w:pPr>
+              <w:keepNext/>
+              <w:keepLines/>
+              <w:spacing w:before="0" w:after="0" w:line="280" w:lineRule="exact"/>
+              <w:ind w:left="0" w:firstLine="0"/>
+              <w:jc w:val="left"/>
             </w:pPr>
             <w:r>
               <w:t xml:space="preserve">$9,500</w:t>
@@ -644,11 +919,20 @@
         </w:tc>
       </w:tr>
       <w:tr>
-        <w:tc>
-          <w:tcPr/>
-          <w:p>
-            <w:pPr>
-              <w:pStyle w:val="Compact"/>
+        <w:trPr>
+          <w:cantSplit/>
+        </w:trPr>
+        <w:tc>
+          <w:tcPr>
+            <w:tcW w:w="1531" w:type="dxa"/>
+          </w:tcPr>
+          <w:p>
+            <w:pPr>
+              <w:keepNext/>
+              <w:keepLines/>
+              <w:spacing w:before="0" w:after="0" w:line="280" w:lineRule="exact"/>
+              <w:ind w:left="0" w:firstLine="0"/>
+              <w:jc w:val="left"/>
             </w:pPr>
             <w:r>
               <w:t xml:space="preserve">02/27/2025</w:t>
@@ -656,21 +940,51 @@
           </w:p>
         </w:tc>
         <w:tc>
-          <w:tcPr/>
-          <w:p>
-            <w:pPr>
-              <w:pStyle w:val="Compact"/>
-            </w:pPr>
-            <w:r>
-              <w:t xml:space="preserve">Skincare/medical spa products (botox/fillers)</w:t>
-            </w:r>
-          </w:p>
-        </w:tc>
-        <w:tc>
-          <w:tcPr/>
-          <w:p>
-            <w:pPr>
-              <w:pStyle w:val="Compact"/>
+          <w:tcPr>
+            <w:tcW w:w="5578" w:type="dxa"/>
+          </w:tcPr>
+          <w:p>
+            <w:pPr>
+              <w:keepNext/>
+              <w:keepLines/>
+              <w:spacing w:before="0" w:after="0" w:line="280" w:lineRule="exact"/>
+              <w:ind w:left="0" w:firstLine="0"/>
+              <w:jc w:val="left"/>
+            </w:pPr>
+            <w:r>
+              <w:t xml:space="preserve">Skincare/​medical</w:t>
+            </w:r>
+            <w:r>
+              <w:t xml:space="preserve"> </w:t>
+            </w:r>
+            <w:r>
+              <w:t xml:space="preserve">spa</w:t>
+            </w:r>
+            <w:r>
+              <w:t xml:space="preserve"> </w:t>
+            </w:r>
+            <w:r>
+              <w:t xml:space="preserve">products</w:t>
+            </w:r>
+            <w:r>
+              <w:t xml:space="preserve"> </w:t>
+            </w:r>
+            <w:r>
+              <w:t xml:space="preserve">(botox/​fillers)</w:t>
+            </w:r>
+          </w:p>
+        </w:tc>
+        <w:tc>
+          <w:tcPr>
+            <w:tcW w:w="1531" w:type="dxa"/>
+          </w:tcPr>
+          <w:p>
+            <w:pPr>
+              <w:keepNext/>
+              <w:keepLines/>
+              <w:spacing w:before="0" w:after="0" w:line="280" w:lineRule="exact"/>
+              <w:ind w:left="0" w:firstLine="0"/>
+              <w:jc w:val="left"/>
             </w:pPr>
             <w:r>
               <w:t xml:space="preserve">$6,193</w:t>
@@ -679,11 +993,20 @@
         </w:tc>
       </w:tr>
       <w:tr>
-        <w:tc>
-          <w:tcPr/>
-          <w:p>
-            <w:pPr>
-              <w:pStyle w:val="Compact"/>
+        <w:trPr>
+          <w:cantSplit/>
+        </w:trPr>
+        <w:tc>
+          <w:tcPr>
+            <w:tcW w:w="1531" w:type="dxa"/>
+          </w:tcPr>
+          <w:p>
+            <w:pPr>
+              <w:keepNext/>
+              <w:keepLines/>
+              <w:spacing w:before="0" w:after="0" w:line="280" w:lineRule="exact"/>
+              <w:ind w:left="0" w:firstLine="0"/>
+              <w:jc w:val="left"/>
             </w:pPr>
             <w:r>
               <w:t xml:space="preserve">03/11/2025</w:t>
@@ -691,21 +1014,39 @@
           </w:p>
         </w:tc>
         <w:tc>
-          <w:tcPr/>
-          <w:p>
-            <w:pPr>
-              <w:pStyle w:val="Compact"/>
-            </w:pPr>
-            <w:r>
-              <w:t xml:space="preserve">Surgical Supplies</w:t>
-            </w:r>
-          </w:p>
-        </w:tc>
-        <w:tc>
-          <w:tcPr/>
-          <w:p>
-            <w:pPr>
-              <w:pStyle w:val="Compact"/>
+          <w:tcPr>
+            <w:tcW w:w="5578" w:type="dxa"/>
+          </w:tcPr>
+          <w:p>
+            <w:pPr>
+              <w:keepNext/>
+              <w:keepLines/>
+              <w:spacing w:before="0" w:after="0" w:line="280" w:lineRule="exact"/>
+              <w:ind w:left="0" w:firstLine="0"/>
+              <w:jc w:val="left"/>
+            </w:pPr>
+            <w:r>
+              <w:t xml:space="preserve">Surgical</w:t>
+            </w:r>
+            <w:r>
+              <w:t xml:space="preserve"> </w:t>
+            </w:r>
+            <w:r>
+              <w:t xml:space="preserve">Supplies</w:t>
+            </w:r>
+          </w:p>
+        </w:tc>
+        <w:tc>
+          <w:tcPr>
+            <w:tcW w:w="1531" w:type="dxa"/>
+          </w:tcPr>
+          <w:p>
+            <w:pPr>
+              <w:keepNext/>
+              <w:keepLines/>
+              <w:spacing w:before="0" w:after="0" w:line="280" w:lineRule="exact"/>
+              <w:ind w:left="0" w:firstLine="0"/>
+              <w:jc w:val="left"/>
             </w:pPr>
             <w:r>
               <w:t xml:space="preserve">$4,223</w:t>
@@ -714,11 +1055,20 @@
         </w:tc>
       </w:tr>
       <w:tr>
-        <w:tc>
-          <w:tcPr/>
-          <w:p>
-            <w:pPr>
-              <w:pStyle w:val="Compact"/>
+        <w:trPr>
+          <w:cantSplit/>
+        </w:trPr>
+        <w:tc>
+          <w:tcPr>
+            <w:tcW w:w="1531" w:type="dxa"/>
+          </w:tcPr>
+          <w:p>
+            <w:pPr>
+              <w:keepNext/>
+              <w:keepLines/>
+              <w:spacing w:before="0" w:after="0" w:line="280" w:lineRule="exact"/>
+              <w:ind w:left="0" w:firstLine="0"/>
+              <w:jc w:val="left"/>
             </w:pPr>
             <w:r>
               <w:t xml:space="preserve">03/12/2025</w:t>
@@ -726,21 +1076,51 @@
           </w:p>
         </w:tc>
         <w:tc>
-          <w:tcPr/>
-          <w:p>
-            <w:pPr>
-              <w:pStyle w:val="Compact"/>
-            </w:pPr>
-            <w:r>
-              <w:t xml:space="preserve">Skincare/medical spa products (botox/fillers)</w:t>
-            </w:r>
-          </w:p>
-        </w:tc>
-        <w:tc>
-          <w:tcPr/>
-          <w:p>
-            <w:pPr>
-              <w:pStyle w:val="Compact"/>
+          <w:tcPr>
+            <w:tcW w:w="5578" w:type="dxa"/>
+          </w:tcPr>
+          <w:p>
+            <w:pPr>
+              <w:keepNext/>
+              <w:keepLines/>
+              <w:spacing w:before="0" w:after="0" w:line="280" w:lineRule="exact"/>
+              <w:ind w:left="0" w:firstLine="0"/>
+              <w:jc w:val="left"/>
+            </w:pPr>
+            <w:r>
+              <w:t xml:space="preserve">Skincare/​medical</w:t>
+            </w:r>
+            <w:r>
+              <w:t xml:space="preserve"> </w:t>
+            </w:r>
+            <w:r>
+              <w:t xml:space="preserve">spa</w:t>
+            </w:r>
+            <w:r>
+              <w:t xml:space="preserve"> </w:t>
+            </w:r>
+            <w:r>
+              <w:t xml:space="preserve">products</w:t>
+            </w:r>
+            <w:r>
+              <w:t xml:space="preserve"> </w:t>
+            </w:r>
+            <w:r>
+              <w:t xml:space="preserve">(botox/​fillers)</w:t>
+            </w:r>
+          </w:p>
+        </w:tc>
+        <w:tc>
+          <w:tcPr>
+            <w:tcW w:w="1531" w:type="dxa"/>
+          </w:tcPr>
+          <w:p>
+            <w:pPr>
+              <w:keepNext/>
+              <w:keepLines/>
+              <w:spacing w:before="0" w:after="0" w:line="280" w:lineRule="exact"/>
+              <w:ind w:left="0" w:firstLine="0"/>
+              <w:jc w:val="left"/>
             </w:pPr>
             <w:r>
               <w:t xml:space="preserve">$4,740</w:t>
@@ -749,11 +1129,20 @@
         </w:tc>
       </w:tr>
       <w:tr>
-        <w:tc>
-          <w:tcPr/>
-          <w:p>
-            <w:pPr>
-              <w:pStyle w:val="Compact"/>
+        <w:trPr>
+          <w:cantSplit/>
+        </w:trPr>
+        <w:tc>
+          <w:tcPr>
+            <w:tcW w:w="1531" w:type="dxa"/>
+          </w:tcPr>
+          <w:p>
+            <w:pPr>
+              <w:keepNext/>
+              <w:keepLines/>
+              <w:spacing w:before="0" w:after="0" w:line="280" w:lineRule="exact"/>
+              <w:ind w:left="0" w:firstLine="0"/>
+              <w:jc w:val="left"/>
             </w:pPr>
             <w:r>
               <w:t xml:space="preserve">03/31/2025</w:t>
@@ -761,21 +1150,45 @@
           </w:p>
         </w:tc>
         <w:tc>
-          <w:tcPr/>
-          <w:p>
-            <w:pPr>
-              <w:pStyle w:val="Compact"/>
-            </w:pPr>
-            <w:r>
-              <w:t xml:space="preserve">Visia facial scanner</w:t>
-            </w:r>
-          </w:p>
-        </w:tc>
-        <w:tc>
-          <w:tcPr/>
-          <w:p>
-            <w:pPr>
-              <w:pStyle w:val="Compact"/>
+          <w:tcPr>
+            <w:tcW w:w="5578" w:type="dxa"/>
+          </w:tcPr>
+          <w:p>
+            <w:pPr>
+              <w:keepNext/>
+              <w:keepLines/>
+              <w:spacing w:before="0" w:after="0" w:line="280" w:lineRule="exact"/>
+              <w:ind w:left="0" w:firstLine="0"/>
+              <w:jc w:val="left"/>
+            </w:pPr>
+            <w:r>
+              <w:t xml:space="preserve">Visia</w:t>
+            </w:r>
+            <w:r>
+              <w:t xml:space="preserve"> </w:t>
+            </w:r>
+            <w:r>
+              <w:t xml:space="preserve">facial</w:t>
+            </w:r>
+            <w:r>
+              <w:t xml:space="preserve"> </w:t>
+            </w:r>
+            <w:r>
+              <w:t xml:space="preserve">scanner</w:t>
+            </w:r>
+          </w:p>
+        </w:tc>
+        <w:tc>
+          <w:tcPr>
+            <w:tcW w:w="1531" w:type="dxa"/>
+          </w:tcPr>
+          <w:p>
+            <w:pPr>
+              <w:keepNext/>
+              <w:keepLines/>
+              <w:spacing w:before="0" w:after="0" w:line="280" w:lineRule="exact"/>
+              <w:ind w:left="0" w:firstLine="0"/>
+              <w:jc w:val="left"/>
             </w:pPr>
             <w:r>
               <w:t xml:space="preserve">$12,500</w:t>
@@ -784,11 +1197,20 @@
         </w:tc>
       </w:tr>
       <w:tr>
-        <w:tc>
-          <w:tcPr/>
-          <w:p>
-            <w:pPr>
-              <w:pStyle w:val="Compact"/>
+        <w:trPr>
+          <w:cantSplit/>
+        </w:trPr>
+        <w:tc>
+          <w:tcPr>
+            <w:tcW w:w="1531" w:type="dxa"/>
+          </w:tcPr>
+          <w:p>
+            <w:pPr>
+              <w:keepNext/>
+              <w:keepLines/>
+              <w:spacing w:before="0" w:after="0" w:line="280" w:lineRule="exact"/>
+              <w:ind w:left="0" w:firstLine="0"/>
+              <w:jc w:val="left"/>
             </w:pPr>
             <w:r>
               <w:t xml:space="preserve">03/31/2025</w:t>
@@ -796,21 +1218,51 @@
           </w:p>
         </w:tc>
         <w:tc>
-          <w:tcPr/>
-          <w:p>
-            <w:pPr>
-              <w:pStyle w:val="Compact"/>
-            </w:pPr>
-            <w:r>
-              <w:t xml:space="preserve">Medical spa/skincare products (botox/fillers)</w:t>
-            </w:r>
-          </w:p>
-        </w:tc>
-        <w:tc>
-          <w:tcPr/>
-          <w:p>
-            <w:pPr>
-              <w:pStyle w:val="Compact"/>
+          <w:tcPr>
+            <w:tcW w:w="5578" w:type="dxa"/>
+          </w:tcPr>
+          <w:p>
+            <w:pPr>
+              <w:keepNext/>
+              <w:keepLines/>
+              <w:spacing w:before="0" w:after="0" w:line="280" w:lineRule="exact"/>
+              <w:ind w:left="0" w:firstLine="0"/>
+              <w:jc w:val="left"/>
+            </w:pPr>
+            <w:r>
+              <w:t xml:space="preserve">Medical</w:t>
+            </w:r>
+            <w:r>
+              <w:t xml:space="preserve"> </w:t>
+            </w:r>
+            <w:r>
+              <w:t xml:space="preserve">spa/​skincare</w:t>
+            </w:r>
+            <w:r>
+              <w:t xml:space="preserve"> </w:t>
+            </w:r>
+            <w:r>
+              <w:t xml:space="preserve">products</w:t>
+            </w:r>
+            <w:r>
+              <w:t xml:space="preserve"> </w:t>
+            </w:r>
+            <w:r>
+              <w:t xml:space="preserve">(botox/​fillers)</w:t>
+            </w:r>
+          </w:p>
+        </w:tc>
+        <w:tc>
+          <w:tcPr>
+            <w:tcW w:w="1531" w:type="dxa"/>
+          </w:tcPr>
+          <w:p>
+            <w:pPr>
+              <w:keepNext/>
+              <w:keepLines/>
+              <w:spacing w:before="0" w:after="0" w:line="280" w:lineRule="exact"/>
+              <w:ind w:left="0" w:firstLine="0"/>
+              <w:jc w:val="left"/>
             </w:pPr>
             <w:r>
               <w:t xml:space="preserve">$4,887</w:t>
@@ -819,11 +1271,20 @@
         </w:tc>
       </w:tr>
       <w:tr>
-        <w:tc>
-          <w:tcPr/>
-          <w:p>
-            <w:pPr>
-              <w:pStyle w:val="Compact"/>
+        <w:trPr>
+          <w:cantSplit/>
+        </w:trPr>
+        <w:tc>
+          <w:tcPr>
+            <w:tcW w:w="1531" w:type="dxa"/>
+          </w:tcPr>
+          <w:p>
+            <w:pPr>
+              <w:keepNext/>
+              <w:keepLines/>
+              <w:spacing w:before="0" w:after="0" w:line="280" w:lineRule="exact"/>
+              <w:ind w:left="0" w:firstLine="0"/>
+              <w:jc w:val="left"/>
             </w:pPr>
             <w:r>
               <w:t xml:space="preserve">04/04/2025</w:t>
@@ -831,21 +1292,39 @@
           </w:p>
         </w:tc>
         <w:tc>
-          <w:tcPr/>
-          <w:p>
-            <w:pPr>
-              <w:pStyle w:val="Compact"/>
-            </w:pPr>
-            <w:r>
-              <w:t xml:space="preserve">Surgical supplies</w:t>
-            </w:r>
-          </w:p>
-        </w:tc>
-        <w:tc>
-          <w:tcPr/>
-          <w:p>
-            <w:pPr>
-              <w:pStyle w:val="Compact"/>
+          <w:tcPr>
+            <w:tcW w:w="5578" w:type="dxa"/>
+          </w:tcPr>
+          <w:p>
+            <w:pPr>
+              <w:keepNext/>
+              <w:keepLines/>
+              <w:spacing w:before="0" w:after="0" w:line="280" w:lineRule="exact"/>
+              <w:ind w:left="0" w:firstLine="0"/>
+              <w:jc w:val="left"/>
+            </w:pPr>
+            <w:r>
+              <w:t xml:space="preserve">Surgical</w:t>
+            </w:r>
+            <w:r>
+              <w:t xml:space="preserve"> </w:t>
+            </w:r>
+            <w:r>
+              <w:t xml:space="preserve">supplies</w:t>
+            </w:r>
+          </w:p>
+        </w:tc>
+        <w:tc>
+          <w:tcPr>
+            <w:tcW w:w="1531" w:type="dxa"/>
+          </w:tcPr>
+          <w:p>
+            <w:pPr>
+              <w:keepNext/>
+              <w:keepLines/>
+              <w:spacing w:before="0" w:after="0" w:line="280" w:lineRule="exact"/>
+              <w:ind w:left="0" w:firstLine="0"/>
+              <w:jc w:val="left"/>
             </w:pPr>
             <w:r>
               <w:t xml:space="preserve">$5,087.82</w:t>
@@ -854,11 +1333,20 @@
         </w:tc>
       </w:tr>
       <w:tr>
-        <w:tc>
-          <w:tcPr/>
-          <w:p>
-            <w:pPr>
-              <w:pStyle w:val="Compact"/>
+        <w:trPr>
+          <w:cantSplit/>
+        </w:trPr>
+        <w:tc>
+          <w:tcPr>
+            <w:tcW w:w="1531" w:type="dxa"/>
+          </w:tcPr>
+          <w:p>
+            <w:pPr>
+              <w:keepNext/>
+              <w:keepLines/>
+              <w:spacing w:before="0" w:after="0" w:line="280" w:lineRule="exact"/>
+              <w:ind w:left="0" w:firstLine="0"/>
+              <w:jc w:val="left"/>
             </w:pPr>
             <w:r>
               <w:t xml:space="preserve">05/05/2025</w:t>
@@ -866,21 +1354,39 @@
           </w:p>
         </w:tc>
         <w:tc>
-          <w:tcPr/>
-          <w:p>
-            <w:pPr>
-              <w:pStyle w:val="Compact"/>
-            </w:pPr>
-            <w:r>
-              <w:t xml:space="preserve">CO2 laser</w:t>
-            </w:r>
-          </w:p>
-        </w:tc>
-        <w:tc>
-          <w:tcPr/>
-          <w:p>
-            <w:pPr>
-              <w:pStyle w:val="Compact"/>
+          <w:tcPr>
+            <w:tcW w:w="5578" w:type="dxa"/>
+          </w:tcPr>
+          <w:p>
+            <w:pPr>
+              <w:keepNext/>
+              <w:keepLines/>
+              <w:spacing w:before="0" w:after="0" w:line="280" w:lineRule="exact"/>
+              <w:ind w:left="0" w:firstLine="0"/>
+              <w:jc w:val="left"/>
+            </w:pPr>
+            <w:r>
+              <w:t xml:space="preserve">CO2</w:t>
+            </w:r>
+            <w:r>
+              <w:t xml:space="preserve"> </w:t>
+            </w:r>
+            <w:r>
+              <w:t xml:space="preserve">laser</w:t>
+            </w:r>
+          </w:p>
+        </w:tc>
+        <w:tc>
+          <w:tcPr>
+            <w:tcW w:w="1531" w:type="dxa"/>
+          </w:tcPr>
+          <w:p>
+            <w:pPr>
+              <w:keepNext/>
+              <w:keepLines/>
+              <w:spacing w:before="0" w:after="0" w:line="280" w:lineRule="exact"/>
+              <w:ind w:left="0" w:firstLine="0"/>
+              <w:jc w:val="left"/>
             </w:pPr>
             <w:r>
               <w:t xml:space="preserve">$27,000</w:t>
@@ -889,19 +1395,30 @@
         </w:tc>
       </w:tr>
       <w:tr>
-        <w:tc>
-          <w:tcPr/>
-          <w:p>
-            <w:pPr>
-              <w:pStyle w:val="Compact"/>
-            </w:pPr>
-          </w:p>
-        </w:tc>
-        <w:tc>
-          <w:tcPr/>
-          <w:p>
-            <w:pPr>
-              <w:pStyle w:val="Compact"/>
+        <w:trPr>
+          <w:cantSplit/>
+        </w:trPr>
+        <w:tc>
+          <w:tcPr>
+            <w:tcW w:w="1531" w:type="dxa"/>
+          </w:tcPr>
+          <w:p>
+            <w:pPr>
+              <w:spacing w:before="0" w:after="0" w:line="280" w:lineRule="exact"/>
+              <w:ind w:left="0" w:firstLine="0"/>
+              <w:jc w:val="left"/>
+            </w:pPr>
+          </w:p>
+        </w:tc>
+        <w:tc>
+          <w:tcPr>
+            <w:tcW w:w="5578" w:type="dxa"/>
+          </w:tcPr>
+          <w:p>
+            <w:pPr>
+              <w:spacing w:before="0" w:after="0" w:line="280" w:lineRule="exact"/>
+              <w:ind w:left="0" w:firstLine="0"/>
+              <w:jc w:val="left"/>
             </w:pPr>
             <w:r>
               <w:rPr>
@@ -913,10 +1430,14 @@
           </w:p>
         </w:tc>
         <w:tc>
-          <w:tcPr/>
-          <w:p>
-            <w:pPr>
-              <w:pStyle w:val="Compact"/>
+          <w:tcPr>
+            <w:tcW w:w="1531" w:type="dxa"/>
+          </w:tcPr>
+          <w:p>
+            <w:pPr>
+              <w:spacing w:before="0" w:after="0" w:line="280" w:lineRule="exact"/>
+              <w:ind w:left="0" w:firstLine="0"/>
+              <w:jc w:val="left"/>
             </w:pPr>
             <w:r>
               <w:rPr>
@@ -931,6 +1452,11 @@
     </w:tbl>
     <w:p>
       <w:pPr>
+        <w:spacing w:before="0" w:after="0" w:line="120" w:lineRule="exact"/>
+      </w:pPr>
+    </w:p>
+    <w:p>
+      <w:pPr>
         <w:pStyle w:val="NumberedParagraph"/>
       </w:pPr>
       <w:r>
@@ -975,7 +1501,13 @@
         <w:t xml:space="preserve">Earlham Savings Bank v. Morrell (In re Morrell)</w:t>
       </w:r>
       <w:r>
-        <w:t xml:space="preserve">, No. 10-05431 (Bankr. S.D. Iowa March 28, 2014), Plaintiff alleges that at least $55,437.82 of Debtors’ guaranteed indebtedness owing to Plaintiff should be excepted from discharge under § 523(a)(6).</w:t>
+        <w:t xml:space="preserve">, No. 10</w:t>
+      </w:r>
+      <w:r>
+        <w:noBreakHyphen/>
+      </w:r>
+      <w:r>
+        <w:t xml:space="preserve">05431 (Bankr. S.D. Iowa March 28, 2014), Plaintiff alleges that at least $55,437.82 of Debtors’ guaranteed indebtedness owing to Plaintiff should be excepted from discharge under § 523(a)⁠(6).</w:t>
       </w:r>
     </w:p>
     <w:p>
@@ -989,13 +1521,13 @@
         <w:tab/>
       </w:r>
       <w:r>
-        <w:t xml:space="preserve">11 U.S.C. § 523(a)(6) provides in relevant part</w:t>
+        <w:t xml:space="preserve">11 U.S.C. § 523(a)⁠(6) provides in relevant part</w:t>
       </w:r>
       <w:r>
         <w:t xml:space="preserve"> </w:t>
       </w:r>
       <w:r>
-        <w:t xml:space="preserve">“(a) A discharge under section 727 . . . of this title does not discharge an individual debtor from any debt . . . (6) for willful and malicious injury by the debtor to another entity or to the property of another entity.”</w:t>
+        <w:t xml:space="preserve">“(a) A discharge under section 727 . . . of this title does not discharge an individual debtor from any debt . . . (6) for willful and malicious injury by the debtor to another entity or to the property of another entity.”</w:t>
       </w:r>
     </w:p>
     <w:p>
@@ -1009,7 +1541,7 @@
         <w:tab/>
       </w:r>
       <w:r>
-        <w:t xml:space="preserve">A debtor acting on behalf of a corporation, who actively converts property or commits any other tort giving rise to a nondischargeable debt under § 523 is personally responsible to the injured party and the debt is nondischargeable under § 523.</w:t>
+        <w:t xml:space="preserve">A debtor acting on behalf of a corporation, who actively converts property or commits any other tort giving rise to a nondischargeable debt under § 523 is personally responsible to the injured party and the debt is nondischargeable under § 523.</w:t>
       </w:r>
       <w:r>
         <w:t xml:space="preserve"> </w:t>
@@ -1019,10 +1551,22 @@
           <w:i/>
           <w:iCs/>
         </w:rPr>
-        <w:t xml:space="preserve">See Kraus Anderson Capital, Inc. v. Dean R. Bradley</w:t>
-      </w:r>
-      <w:r>
-        <w:t xml:space="preserve">, 14 Fed App. 0001 (6th Cir. BAP, 3-26-2014, footnote 2) and cases cited therein.</w:t>
+        <w:t xml:space="preserve">See Kraus Anderson Capital, Inc. v. Dean R. Bradley</w:t>
+      </w:r>
+      <w:r>
+        <w:t xml:space="preserve">, 14 Fed App. 0001 (6th Cir. BAP, 3</w:t>
+      </w:r>
+      <w:r>
+        <w:noBreakHyphen/>
+      </w:r>
+      <w:r>
+        <w:t xml:space="preserve">26</w:t>
+      </w:r>
+      <w:r>
+        <w:noBreakHyphen/>
+      </w:r>
+      <w:r>
+        <w:t xml:space="preserve">2014, footnote 2) and cases cited therein.</w:t>
       </w:r>
     </w:p>
     <w:p>
@@ -1035,7 +1579,7 @@
     </w:p>
     <w:p>
       <w:pPr>
-        <w:pStyle w:val="IndentedParagraph"/>
+        <w:pStyle w:val="BodyText"/>
       </w:pPr>
       <w:r>
         <w:t xml:space="preserve">WHEREFORE, Plaintiff respectfully prays that this Court enter and enroll an Order granting the Plaintiff the following relief:</w:t>
@@ -1052,7 +1596,7 @@
         <w:tab/>
       </w:r>
       <w:r>
-        <w:t xml:space="preserve">Decreeing that $55,437.82 of the indebtedness owing by Guarantors under their Guaranties is nondischargeable pursuant to § 523(a)(6).</w:t>
+        <w:t xml:space="preserve">Decreeing that $55,437.82 of the indebtedness owing by Guarantors under their Guaranties is nondischargeable pursuant to § 523(a)⁠(6).</w:t>
       </w:r>
     </w:p>
     <w:p>
@@ -1066,7 +1610,7 @@
         <w:tab/>
       </w:r>
       <w:r>
-        <w:t xml:space="preserve">Decreeing that any and all other sales or transfers of Plaintiff’s collateral out of the ordinary course of business, for which the proceeds therefrom were not turned over to Plaintiff, be deemed nondischargeable pursuant to § 523(a)(6).</w:t>
+        <w:t xml:space="preserve">Decreeing that any and all other sales or transfers of Plaintiff’s collateral out of the ordinary course of business, for which the proceeds therefrom were not turned over to Plaintiff, be deemed nondischargeable pursuant to § 523(a)⁠(6).</w:t>
       </w:r>
     </w:p>
     <w:p>
@@ -1090,10 +1634,16 @@
           <w:i/>
           <w:iCs/>
         </w:rPr>
-        <w:t xml:space="preserve">See Kruse et al. v. Weller (In re Weller)</w:t>
-      </w:r>
-      <w:r>
-        <w:t xml:space="preserve">, No. 22-00173 (Bankr. S.D. Iowa March 6, 2023).</w:t>
+        <w:t xml:space="preserve">See Kruse et al. v. Weller (In re Weller)</w:t>
+      </w:r>
+      <w:r>
+        <w:t xml:space="preserve">, No. 22</w:t>
+      </w:r>
+      <w:r>
+        <w:noBreakHyphen/>
+      </w:r>
+      <w:r>
+        <w:t xml:space="preserve">00173 (Bankr. S.D. Iowa March 6, 2023).</w:t>
       </w:r>
     </w:p>
     <w:p>
@@ -1112,26 +1662,20 @@
     </w:p>
     <w:p>
       <w:pPr>
-        <w:pStyle w:val="BodyText"/>
+        <w:spacing w:before="0" w:after="0" w:line="480" w:lineRule="exact"/>
       </w:pPr>
     </w:p>
     <w:tbl>
       <w:tblPr>
         <w:tblW w:w="9360" w:type="dxa"/>
-        <w:tblBorders>
-          <w:top w:val="nil"/>
-          <w:left w:val="nil"/>
-          <w:bottom w:val="nil"/>
-          <w:right w:val="nil"/>
-          <w:insideH w:val="nil"/>
-          <w:insideV w:val="nil"/>
-        </w:tblBorders>
         <w:tblLayout w:type="fixed"/>
         <w:tblCellMar>
+          <w:top w:w="0" w:type="dxa"/>
           <w:left w:w="0" w:type="dxa"/>
+          <w:bottom w:w="0" w:type="dxa"/>
           <w:right w:w="0" w:type="dxa"/>
         </w:tblCellMar>
-        <w:tblLook w:val="0000"/>
+        <w:tblLook w:val="0000" w:firstRow="0" w:lastRow="0" w:firstColumn="0" w:lastColumn="0" w:noHBand="0" w:noVBand="0"/>
       </w:tblPr>
       <w:tblGrid>
         <w:gridCol w:w="4032"/>
@@ -1148,10 +1692,27 @@
           </w:tcPr>
           <w:p>
             <w:pPr>
-              <w:pStyle w:val="SingleSpaced"/>
-            </w:pPr>
-            <w:r>
-              <w:t xml:space="preserve">Dated: September 3, 2025</w:t>
+              <w:spacing w:before="0" w:after="0" w:line="280" w:lineRule="exact"/>
+              <w:ind w:left="0" w:firstLine="0"/>
+              <w:jc w:val="left"/>
+            </w:pPr>
+            <w:r>
+              <w:t xml:space="preserve">Dated: </w:t>
+            </w:r>
+            <w:r>
+              <w:t xml:space="preserve">September</w:t>
+            </w:r>
+            <w:r>
+              <w:t xml:space="preserve"> </w:t>
+            </w:r>
+            <w:r>
+              <w:t xml:space="preserve">3,</w:t>
+            </w:r>
+            <w:r>
+              <w:t xml:space="preserve"> </w:t>
+            </w:r>
+            <w:r>
+              <w:t xml:space="preserve">2025</w:t>
             </w:r>
           </w:p>
         </w:tc>
@@ -1161,7 +1722,9 @@
           </w:tcPr>
           <w:p>
             <w:pPr>
-              <w:pStyle w:val="SingleSpaced"/>
+              <w:spacing w:before="0" w:after="0" w:line="280" w:lineRule="exact"/>
+              <w:ind w:left="0" w:firstLine="0"/>
+              <w:jc w:val="left"/>
             </w:pPr>
           </w:p>
         </w:tc>
@@ -1171,8 +1734,9 @@
           </w:tcPr>
           <w:p>
             <w:pPr>
-              <w:pStyle w:val="SingleSpaced"/>
-              <w:spacing w:before="0" w:after="120" w:line="240" w:lineRule="auto"/>
+              <w:spacing w:before="0" w:after="0" w:line="280" w:lineRule="exact"/>
+              <w:ind w:left="0" w:firstLine="0"/>
+              <w:jc w:val="left"/>
             </w:pPr>
             <w:r>
               <w:t xml:space="preserve">Respectfully submitted,</w:t>
@@ -1180,29 +1744,49 @@
           </w:p>
           <w:p>
             <w:pPr>
-              <w:pStyle w:val="SingleSpaced"/>
-              <w:spacing w:before="0" w:after="120" w:line="240" w:lineRule="auto"/>
-            </w:pPr>
-          </w:p>
-          <w:p>
-            <w:pPr>
-              <w:pStyle w:val="SingleSpaced"/>
-              <w:spacing w:before="0" w:after="120" w:line="240" w:lineRule="auto"/>
-            </w:pPr>
-            <w:r>
-              <w:t xml:space="preserve">SOUTH STORY BANK &amp; TRUST, Plaintiff</w:t>
-            </w:r>
-          </w:p>
-          <w:p>
-            <w:pPr>
-              <w:pStyle w:val="SingleSpaced"/>
-              <w:spacing w:before="0" w:after="120" w:line="240" w:lineRule="auto"/>
-            </w:pPr>
-          </w:p>
-          <w:p>
-            <w:pPr>
-              <w:pStyle w:val="SingleSpaced"/>
-              <w:spacing w:before="0" w:after="120" w:line="240" w:lineRule="auto"/>
+              <w:spacing w:before="280" w:after="0" w:line="280" w:lineRule="exact"/>
+              <w:ind w:left="0" w:firstLine="0"/>
+              <w:jc w:val="left"/>
+            </w:pPr>
+            <w:r>
+              <w:t xml:space="preserve">SOUTH</w:t>
+            </w:r>
+            <w:r>
+              <w:t xml:space="preserve"> </w:t>
+            </w:r>
+            <w:r>
+              <w:t xml:space="preserve">STORY</w:t>
+            </w:r>
+            <w:r>
+              <w:t xml:space="preserve"> </w:t>
+            </w:r>
+            <w:r>
+              <w:t xml:space="preserve">BANK</w:t>
+            </w:r>
+            <w:r>
+              <w:t xml:space="preserve"> </w:t>
+            </w:r>
+            <w:r>
+              <w:t xml:space="preserve">&amp;</w:t>
+            </w:r>
+            <w:r>
+              <w:t xml:space="preserve"> </w:t>
+            </w:r>
+            <w:r>
+              <w:t xml:space="preserve">TRUST,</w:t>
+            </w:r>
+            <w:r>
+              <w:t xml:space="preserve"> </w:t>
+            </w:r>
+            <w:r>
+              <w:t xml:space="preserve">Plaintiff</w:t>
+            </w:r>
+          </w:p>
+          <w:p>
+            <w:pPr>
+              <w:spacing w:before="280" w:after="0" w:line="280" w:lineRule="exact"/>
+              <w:ind w:left="0" w:firstLine="0"/>
+              <w:jc w:val="left"/>
             </w:pPr>
             <w:r>
               <w:t xml:space="preserve">By: /s/ Nicholas F. Miller</w:t>
@@ -1210,56 +1794,137 @@
           </w:p>
           <w:p>
             <w:pPr>
-              <w:pStyle w:val="SingleSpaced"/>
-              <w:spacing w:before="0" w:after="120" w:line="240" w:lineRule="auto"/>
-            </w:pPr>
-            <w:r>
-              <w:t xml:space="preserve">Nicholas F. Miller</w:t>
-            </w:r>
-          </w:p>
-          <w:p>
-            <w:pPr>
-              <w:pStyle w:val="SingleSpaced"/>
-              <w:spacing w:before="0" w:after="120" w:line="240" w:lineRule="auto"/>
-            </w:pPr>
-            <w:r>
-              <w:t xml:space="preserve">Thomas L. Flynn</w:t>
-            </w:r>
-          </w:p>
-          <w:p>
-            <w:pPr>
-              <w:pStyle w:val="SingleSpaced"/>
-              <w:spacing w:before="0" w:after="120" w:line="240" w:lineRule="auto"/>
-            </w:pPr>
-            <w:r>
-              <w:t xml:space="preserve">6701 Westown Parkway, Suite 100</w:t>
-            </w:r>
-          </w:p>
-          <w:p>
-            <w:pPr>
-              <w:pStyle w:val="SingleSpaced"/>
-              <w:spacing w:before="0" w:after="120" w:line="240" w:lineRule="auto"/>
-            </w:pPr>
-            <w:r>
-              <w:t xml:space="preserve">West Des Moines, Iowa 50266</w:t>
-            </w:r>
-          </w:p>
-          <w:p>
-            <w:pPr>
-              <w:pStyle w:val="SingleSpaced"/>
-              <w:spacing w:before="0" w:after="0" w:line="240" w:lineRule="auto"/>
-            </w:pPr>
-            <w:r>
-              <w:t xml:space="preserve">515-446-3441</w:t>
+              <w:spacing w:before="0" w:after="0" w:line="280" w:lineRule="exact"/>
+              <w:ind w:left="0" w:firstLine="0"/>
+              <w:jc w:val="left"/>
+            </w:pPr>
+            <w:r>
+              <w:t xml:space="preserve">Nicholas</w:t>
+            </w:r>
+            <w:r>
+              <w:t xml:space="preserve"> </w:t>
+            </w:r>
+            <w:r>
+              <w:t xml:space="preserve">F.</w:t>
+            </w:r>
+            <w:r>
+              <w:t xml:space="preserve"> </w:t>
+            </w:r>
+            <w:r>
+              <w:t xml:space="preserve">Miller</w:t>
+            </w:r>
+          </w:p>
+          <w:p>
+            <w:pPr>
+              <w:spacing w:before="0" w:after="0" w:line="280" w:lineRule="exact"/>
+              <w:ind w:left="0" w:firstLine="0"/>
+              <w:jc w:val="left"/>
+            </w:pPr>
+            <w:r>
+              <w:t xml:space="preserve">Thomas</w:t>
+            </w:r>
+            <w:r>
+              <w:t xml:space="preserve"> </w:t>
+            </w:r>
+            <w:r>
+              <w:t xml:space="preserve">L.</w:t>
+            </w:r>
+            <w:r>
+              <w:t xml:space="preserve"> </w:t>
+            </w:r>
+            <w:r>
+              <w:t xml:space="preserve">Flynn</w:t>
+            </w:r>
+          </w:p>
+          <w:p>
+            <w:pPr>
+              <w:spacing w:before="0" w:after="0" w:line="280" w:lineRule="exact"/>
+              <w:ind w:left="0" w:firstLine="0"/>
+              <w:jc w:val="left"/>
+            </w:pPr>
+            <w:r>
+              <w:t xml:space="preserve">6701</w:t>
+            </w:r>
+            <w:r>
+              <w:t xml:space="preserve"> </w:t>
+            </w:r>
+            <w:r>
+              <w:t xml:space="preserve">Westown</w:t>
+            </w:r>
+            <w:r>
+              <w:t xml:space="preserve"> </w:t>
+            </w:r>
+            <w:r>
+              <w:t xml:space="preserve">Parkway,</w:t>
+            </w:r>
+            <w:r>
+              <w:t xml:space="preserve"> </w:t>
+            </w:r>
+            <w:r>
+              <w:t xml:space="preserve">Suite</w:t>
+            </w:r>
+            <w:r>
+              <w:t xml:space="preserve"> </w:t>
+            </w:r>
+            <w:r>
+              <w:t xml:space="preserve">100</w:t>
+            </w:r>
+          </w:p>
+          <w:p>
+            <w:pPr>
+              <w:spacing w:before="0" w:after="0" w:line="280" w:lineRule="exact"/>
+              <w:ind w:left="0" w:firstLine="0"/>
+              <w:jc w:val="left"/>
+            </w:pPr>
+            <w:r>
+              <w:t xml:space="preserve">West</w:t>
+            </w:r>
+            <w:r>
+              <w:t xml:space="preserve"> </w:t>
+            </w:r>
+            <w:r>
+              <w:t xml:space="preserve">Des</w:t>
+            </w:r>
+            <w:r>
+              <w:t xml:space="preserve"> </w:t>
+            </w:r>
+            <w:r>
+              <w:t xml:space="preserve">Moines,</w:t>
+            </w:r>
+            <w:r>
+              <w:t xml:space="preserve"> </w:t>
+            </w:r>
+            <w:r>
+              <w:t xml:space="preserve">Iowa</w:t>
+            </w:r>
+            <w:r>
+              <w:t xml:space="preserve"> </w:t>
+            </w:r>
+            <w:r>
+              <w:t xml:space="preserve">50266</w:t>
+            </w:r>
+          </w:p>
+          <w:p>
+            <w:pPr>
+              <w:spacing w:before="0" w:after="0" w:line="280" w:lineRule="exact"/>
+              <w:ind w:left="0" w:firstLine="0"/>
+              <w:jc w:val="left"/>
+            </w:pPr>
+            <w:r>
+              <w:t xml:space="preserve">515</w:t>
+              <w:noBreakHyphen/>
+              <w:t xml:space="preserve">446</w:t>
+              <w:noBreakHyphen/>
+              <w:t xml:space="preserve">3441</w:t>
             </w:r>
           </w:p>
         </w:tc>
       </w:tr>
     </w:tbl>
     <w:sectPr>
-      <w:footerReference w:type="default" r:id="rIdFtr1"/>
+      <w:footerReference w:type="default" r:id="rIdFooter1"/>
       <w:pgSz w:w="12240" w:h="15840"/>
-      <w:pgMar w:top="1440" w:right="1440" w:bottom="1440" w:left="1440" w:header="720" w:footer="720" w:gutter="0"/>
+      <w:pgMar w:top="1440" w:right="1440" w:bottom="1440" w:left="1440" w:header="720" w:footer="432" w:gutter="0"/>
     </w:sectPr>
   </w:body>
 </w:document>
@@ -1398,43 +2063,565 @@
 </file>
 
 <file path=word/styles.xml><?xml version="1.0" encoding="utf-8"?>
-<w:styles xmlns:w="http://schemas.openxmlformats.org/wordprocessingml/2006/main" xmlns:r="http://schemas.openxmlformats.org/officeDocument/2006/relationships">
+<w:styles xmlns:r="http://schemas.openxmlformats.org/officeDocument/2006/relationships" xmlns:w="http://schemas.openxmlformats.org/wordprocessingml/2006/main">
   <w:docDefaults>
     <w:rPrDefault>
       <w:rPr>
-        <w:rFonts w:ascii="EB Garamond" w:hAnsi="EB Garamond" w:eastAsia="EB Garamond" w:cs="EB Garamond"/>
+        <w:rFonts w:ascii="Times New Roman" w:hAnsi="Times New Roman" w:eastAsia="Times New Roman" w:cs="Times New Roman"/>
         <w:sz w:val="24"/>
         <w:szCs w:val="24"/>
-        <w:lang w:val="en-US"/>
+        <w:lang w:val="en-US" w:eastAsia="zh-CN" w:bidi="ar-SA"/>
       </w:rPr>
     </w:rPrDefault>
     <w:pPrDefault>
       <w:pPr>
-        <w:spacing w:before="0" w:after="0" w:line="240" w:lineRule="auto"/>
+        <w:widowControl/>
+        <w:spacing w:after="0"/>
       </w:pPr>
     </w:pPrDefault>
   </w:docDefaults>
+  <w:latentStyles w:defLockedState="0" w:defUIPriority="0" w:defSemiHidden="0" w:defUnhideWhenUsed="0" w:defQFormat="0" w:count="276"/>
   <w:style w:type="paragraph" w:default="1" w:styleId="Normal">
     <w:name w:val="Normal"/>
     <w:qFormat/>
+  </w:style>
+  <w:style w:type="paragraph" w:styleId="BodyText">
+    <w:name w:val="Body Text"/>
+    <w:basedOn w:val="Normal"/>
+    <w:link w:val="BodyTextChar"/>
+    <w:qFormat/>
     <w:pPr>
-      <w:widowControl/>
+      <w:spacing w:before="0" w:after="0" w:line="480" w:lineRule="exact"/>
+      <w:ind w:firstLine="720"/>
     </w:pPr>
-    <w:rPr>
+  </w:style>
+  <w:style w:type="paragraph" w:customStyle="1" w:styleId="FirstParagraph">
+    <w:name w:val="First Paragraph"/>
+    <w:basedOn w:val="BodyText"/>
+    <w:next w:val="BodyText"/>
+    <w:qFormat/>
+  </w:style>
+  <w:style w:type="paragraph" w:customStyle="1" w:styleId="Compact">
+    <w:name w:val="Compact"/>
+    <w:basedOn w:val="BodyText"/>
+    <w:qFormat/>
+    <w:pPr>
+      <w:spacing w:before="36" w:after="36"/>
+    </w:pPr>
+  </w:style>
+  <w:style w:type="paragraph" w:styleId="Title">
+    <w:name w:val="Title"/>
+    <w:basedOn w:val="Normal"/>
+    <w:next w:val="BodyText"/>
+    <w:link w:val="TitleChar"/>
+    <w:uiPriority w:val="10"/>
+    <w:qFormat/>
+    <w:rsid w:val="00A10FD9"/>
+    <w:pPr>
+      <w:spacing w:after="80" w:line="240" w:lineRule="auto"/>
+      <w:contextualSpacing/>
+      <w:jc w:val="center"/>
+    </w:pPr>
+    <w:rPr>
+      <w:rFonts w:asciiTheme="majorHAnsi" w:eastAsiaTheme="majorEastAsia" w:hAnsiTheme="majorHAnsi" w:cstheme="majorBidi"/>
+      <w:sz w:val="56"/>
+      <w:szCs w:val="56"/>
+    </w:rPr>
+  </w:style>
+  <w:style w:type="character" w:customStyle="1" w:styleId="TitleChar">
+    <w:name w:val="Title Char"/>
+    <w:basedOn w:val="DefaultParagraphFont"/>
+    <w:link w:val="Title"/>
+    <w:uiPriority w:val="10"/>
+    <w:rsid w:val="00A10FD9"/>
+    <w:rPr>
+      <w:rFonts w:asciiTheme="majorHAnsi" w:eastAsiaTheme="majorEastAsia" w:hAnsiTheme="majorHAnsi" w:cstheme="majorBidi"/>
+      <w:sz w:val="56"/>
+      <w:szCs w:val="56"/>
+    </w:rPr>
+  </w:style>
+  <w:style w:type="paragraph" w:styleId="Subtitle">
+    <w:name w:val="Subtitle"/>
+    <w:basedOn w:val="Title"/>
+    <w:next w:val="BodyText"/>
+    <w:link w:val="SubtitleChar"/>
+    <w:uiPriority w:val="11"/>
+    <w:qFormat/>
+    <w:rsid w:val="00A10FD9"/>
+    <w:pPr>
+      <w:numPr>
+        <w:ilvl w:val="1"/>
+      </w:numPr>
+    </w:pPr>
+    <w:rPr>
+      <w:rFonts w:eastAsiaTheme="majorEastAsia" w:cstheme="majorBidi"/>
+      <w:spacing w:val="15"/>
+      <w:sz w:val="28"/>
+      <w:szCs w:val="28"/>
+    </w:rPr>
+  </w:style>
+  <w:style w:type="character" w:customStyle="1" w:styleId="SubtitleChar">
+    <w:name w:val="Subtitle Char"/>
+    <w:basedOn w:val="DefaultParagraphFont"/>
+    <w:link w:val="Subtitle"/>
+    <w:uiPriority w:val="11"/>
+    <w:rsid w:val="00A10FD9"/>
+    <w:rPr>
+      <w:rFonts w:eastAsiaTheme="majorEastAsia" w:cstheme="majorBidi"/>
+      <w:color w:val="595959" w:themeColor="text1" w:themeTint="A6"/>
+      <w:spacing w:val="15"/>
+      <w:sz w:val="28"/>
+      <w:szCs w:val="28"/>
+    </w:rPr>
+  </w:style>
+  <w:style w:type="paragraph" w:customStyle="1" w:styleId="Author">
+    <w:name w:val="Author"/>
+    <w:basedOn w:val="Title"/>
+    <w:next w:val="BodyText"/>
+    <w:qFormat/>
+    <w:pPr>
+      <w:keepNext/>
+      <w:keepLines/>
+    </w:pPr>
+    <w:rPr>
+      <w:sz w:val="24"/>
+      <w:szCs w:val="24"/>
+    </w:rPr>
+  </w:style>
+  <w:style w:type="paragraph" w:styleId="Date">
+    <w:name w:val="Date"/>
+    <w:basedOn w:val="Title"/>
+    <w:next w:val="BodyText"/>
+    <w:qFormat/>
+    <w:pPr>
+      <w:keepNext/>
+      <w:keepLines/>
+    </w:pPr>
+    <w:rPr>
+      <w:sz w:val="24"/>
+      <w:szCs w:val="24"/>
+    </w:rPr>
+  </w:style>
+  <w:style w:type="paragraph" w:customStyle="1" w:styleId="AbstractTitle">
+    <w:name w:val="Abstract Title"/>
+    <w:basedOn w:val="Normal"/>
+    <w:next w:val="Abstract"/>
+    <w:qFormat/>
+    <w:pPr>
+      <w:keepNext/>
+      <w:keepLines/>
+      <w:spacing w:before="300" w:after="0"/>
+      <w:jc w:val="center"/>
+    </w:pPr>
+    <w:rPr>
+      <w:b/>
+      <w:sz w:val="20"/>
+      <w:szCs w:val="20"/>
+    </w:rPr>
+  </w:style>
+  <w:style w:type="paragraph" w:customStyle="1" w:styleId="Abstract">
+    <w:name w:val="Abstract"/>
+    <w:basedOn w:val="Normal"/>
+    <w:next w:val="BodyText"/>
+    <w:qFormat/>
+    <w:pPr>
+      <w:keepNext/>
+      <w:keepLines/>
+      <w:spacing w:before="100" w:after="300"/>
+    </w:pPr>
+    <w:rPr>
+      <w:sz w:val="20"/>
+      <w:szCs w:val="20"/>
+    </w:rPr>
+  </w:style>
+  <w:style w:type="paragraph" w:styleId="Bibliography">
+    <w:name w:val="Bibliography"/>
+    <w:basedOn w:val="Normal"/>
+    <w:next w:val="Bibliography"/>
+    <w:qFormat/>
+    <w:pPr/>
+    <w:rPr/>
+  </w:style>
+  <w:style w:type="paragraph" w:styleId="Heading1">
+    <w:name w:val="heading 1"/>
+    <w:basedOn w:val="Normal"/>
+    <w:next w:val="BodyText"/>
+    <w:qFormat/>
+    <w:pPr>
+      <w:keepNext/>
+      <w:keepLines/>
+      <w:spacing w:before="240" w:after="0" w:line="480" w:lineRule="exact"/>
+      <w:ind w:firstLine="0"/>
+      <w:jc w:val="center"/>
+      <w:outlineLvl w:val="0"/>
+    </w:pPr>
+    <w:rPr>
+      <w:b/>
+      <w:bCs/>
       <w:color w:val="000000"/>
-    </w:rPr>
+      <w:sz w:val="24"/>
+      <w:szCs w:val="24"/>
+    </w:rPr>
+  </w:style>
+  <w:style w:type="paragraph" w:styleId="Heading2">
+    <w:name w:val="heading 2"/>
+    <w:basedOn w:val="Normal"/>
+    <w:next w:val="BodyText"/>
+    <w:qFormat/>
+    <w:pPr>
+      <w:keepNext/>
+      <w:keepLines/>
+      <w:spacing w:before="240" w:after="120" w:line="280" w:lineRule="exact"/>
+      <w:ind w:firstLine="0"/>
+      <w:outlineLvl w:val="1"/>
+    </w:pPr>
+    <w:rPr>
+      <w:b/>
+      <w:bCs/>
+      <w:color w:val="000000"/>
+      <w:sz w:val="24"/>
+      <w:szCs w:val="24"/>
+    </w:rPr>
+  </w:style>
+  <w:style w:type="paragraph" w:styleId="Heading3">
+    <w:name w:val="heading 3"/>
+    <w:basedOn w:val="Normal"/>
+    <w:next w:val="BodyText"/>
+    <w:qFormat/>
+    <w:pPr>
+      <w:keepNext/>
+      <w:keepLines/>
+      <w:spacing w:before="240" w:after="120" w:line="280" w:lineRule="exact"/>
+      <w:ind w:firstLine="0"/>
+      <w:outlineLvl w:val="2"/>
+    </w:pPr>
+    <w:rPr>
+      <w:b/>
+      <w:bCs/>
+      <w:i/>
+      <w:iCs/>
+      <w:color w:val="000000"/>
+      <w:sz w:val="24"/>
+      <w:szCs w:val="24"/>
+    </w:rPr>
+  </w:style>
+  <w:style w:type="paragraph" w:styleId="Heading4">
+    <w:name w:val="heading 4"/>
+    <w:basedOn w:val="Normal"/>
+    <w:next w:val="BodyText"/>
+    <w:link w:val="Heading4Char"/>
+    <w:uiPriority w:val="9"/>
+    <w:semiHidden/>
+    <w:unhideWhenUsed/>
+    <w:qFormat/>
+    <w:rsid w:val="00A10FD9"/>
+    <w:pPr>
+      <w:keepNext/>
+      <w:keepLines/>
+      <w:spacing w:before="240" w:after="120" w:line="280" w:lineRule="exact"/>
+      <w:ind w:firstLine="0"/>
+      <w:outlineLvl w:val="3"/>
+    </w:pPr>
+    <w:rPr>
+      <w:rFonts w:ascii="Times New Roman" w:hAnsi="Times New Roman" w:eastAsia="Times New Roman" w:cs="Times New Roman"/>
+      <w:b/>
+      <w:bCs/>
+      <w:i/>
+      <w:color w:val="000000"/>
+      <w:sz w:val="24"/>
+      <w:szCs w:val="24"/>
+    </w:rPr>
+  </w:style>
+  <w:style w:type="paragraph" w:styleId="Heading5">
+    <w:name w:val="heading 5"/>
+    <w:basedOn w:val="Normal"/>
+    <w:next w:val="BodyText"/>
+    <w:link w:val="Heading5Char"/>
+    <w:uiPriority w:val="9"/>
+    <w:semiHidden/>
+    <w:unhideWhenUsed/>
+    <w:qFormat/>
+    <w:rsid w:val="00A10FD9"/>
+    <w:pPr>
+      <w:keepNext/>
+      <w:keepLines/>
+      <w:spacing w:before="240" w:after="120" w:line="280" w:lineRule="exact"/>
+      <w:ind w:firstLine="0"/>
+      <w:outlineLvl w:val="4"/>
+    </w:pPr>
+    <w:rPr>
+      <w:rFonts w:ascii="Times New Roman" w:hAnsi="Times New Roman" w:eastAsia="Times New Roman" w:cs="Times New Roman"/>
+      <w:b/>
+      <w:bCs/>
+      <w:i/>
+      <w:color w:val="000000"/>
+      <w:sz w:val="24"/>
+      <w:szCs w:val="24"/>
+    </w:rPr>
+  </w:style>
+  <w:style w:type="paragraph" w:styleId="Heading6">
+    <w:name w:val="heading 6"/>
+    <w:basedOn w:val="Normal"/>
+    <w:next w:val="BodyText"/>
+    <w:link w:val="Heading6Char"/>
+    <w:uiPriority w:val="9"/>
+    <w:semiHidden/>
+    <w:unhideWhenUsed/>
+    <w:qFormat/>
+    <w:rsid w:val="00A10FD9"/>
+    <w:pPr>
+      <w:keepNext/>
+      <w:keepLines/>
+      <w:spacing w:before="40" w:after="0"/>
+      <w:outlineLvl w:val="5"/>
+    </w:pPr>
+    <w:rPr>
+      <w:rFonts w:eastAsiaTheme="majorEastAsia" w:cstheme="majorBidi"/>
+      <w:i/>
+      <w:iCs/>
+      <w:color w:val="595959" w:themeColor="text1" w:themeTint="A6"/>
+    </w:rPr>
+  </w:style>
+  <w:style w:type="paragraph" w:styleId="Heading7">
+    <w:name w:val="heading 7"/>
+    <w:basedOn w:val="Normal"/>
+    <w:next w:val="BodyText"/>
+    <w:link w:val="Heading7Char"/>
+    <w:uiPriority w:val="9"/>
+    <w:semiHidden/>
+    <w:unhideWhenUsed/>
+    <w:qFormat/>
+    <w:rsid w:val="00A10FD9"/>
+    <w:pPr>
+      <w:keepNext/>
+      <w:keepLines/>
+      <w:spacing w:before="40" w:after="0"/>
+      <w:outlineLvl w:val="6"/>
+    </w:pPr>
+    <w:rPr>
+      <w:rFonts w:eastAsiaTheme="majorEastAsia" w:cstheme="majorBidi"/>
+      <w:color w:val="595959" w:themeColor="text1" w:themeTint="A6"/>
+    </w:rPr>
+  </w:style>
+  <w:style w:type="paragraph" w:styleId="Heading8">
+    <w:name w:val="heading 8"/>
+    <w:basedOn w:val="Normal"/>
+    <w:next w:val="BodyText"/>
+    <w:link w:val="Heading8Char"/>
+    <w:uiPriority w:val="9"/>
+    <w:semiHidden/>
+    <w:unhideWhenUsed/>
+    <w:qFormat/>
+    <w:rsid w:val="00A10FD9"/>
+    <w:pPr>
+      <w:keepNext/>
+      <w:keepLines/>
+      <w:spacing w:after="0"/>
+      <w:outlineLvl w:val="7"/>
+    </w:pPr>
+    <w:rPr>
+      <w:rFonts w:eastAsiaTheme="majorEastAsia" w:cstheme="majorBidi"/>
+      <w:i/>
+      <w:iCs/>
+      <w:color w:val="272727" w:themeColor="text1" w:themeTint="D8"/>
+    </w:rPr>
+  </w:style>
+  <w:style w:type="paragraph" w:styleId="Heading9">
+    <w:name w:val="heading 9"/>
+    <w:basedOn w:val="Normal"/>
+    <w:next w:val="BodyText"/>
+    <w:link w:val="Heading9Char"/>
+    <w:uiPriority w:val="9"/>
+    <w:semiHidden/>
+    <w:unhideWhenUsed/>
+    <w:qFormat/>
+    <w:rsid w:val="00A10FD9"/>
+    <w:pPr>
+      <w:keepNext/>
+      <w:keepLines/>
+      <w:spacing w:after="0"/>
+      <w:outlineLvl w:val="8"/>
+    </w:pPr>
+    <w:rPr>
+      <w:rFonts w:eastAsiaTheme="majorEastAsia" w:cstheme="majorBidi"/>
+      <w:color w:val="272727" w:themeColor="text1" w:themeTint="D8"/>
+    </w:rPr>
+  </w:style>
+  <w:style w:type="character" w:customStyle="1" w:styleId="Heading1Char">
+    <w:name w:val="Heading 1 Char"/>
+    <w:basedOn w:val="DefaultParagraphFont"/>
+    <w:link w:val="Heading1"/>
+    <w:uiPriority w:val="9"/>
+    <w:rsid w:val="00A10FD9"/>
+    <w:rPr>
+      <w:rFonts w:asciiTheme="majorHAnsi" w:eastAsiaTheme="majorEastAsia" w:hAnsiTheme="majorHAnsi" w:cstheme="majorBidi"/>
+      <w:color w:val="0F4761" w:themeColor="accent1" w:themeShade="BF"/>
+      <w:sz w:val="40"/>
+      <w:szCs w:val="40"/>
+    </w:rPr>
+  </w:style>
+  <w:style w:type="character" w:customStyle="1" w:styleId="Heading2Char">
+    <w:name w:val="Heading 2 Char"/>
+    <w:basedOn w:val="DefaultParagraphFont"/>
+    <w:link w:val="Heading2"/>
+    <w:uiPriority w:val="9"/>
+    <w:semiHidden/>
+    <w:rsid w:val="00A10FD9"/>
+    <w:rPr>
+      <w:rFonts w:asciiTheme="majorHAnsi" w:eastAsiaTheme="majorEastAsia" w:hAnsiTheme="majorHAnsi" w:cstheme="majorBidi"/>
+      <w:color w:val="0F4761" w:themeColor="accent1" w:themeShade="BF"/>
+      <w:sz w:val="32"/>
+      <w:szCs w:val="32"/>
+    </w:rPr>
+  </w:style>
+  <w:style w:type="character" w:customStyle="1" w:styleId="Heading3Char">
+    <w:name w:val="Heading 3 Char"/>
+    <w:basedOn w:val="DefaultParagraphFont"/>
+    <w:link w:val="Heading3"/>
+    <w:uiPriority w:val="9"/>
+    <w:semiHidden/>
+    <w:rsid w:val="00A10FD9"/>
+    <w:rPr>
+      <w:rFonts w:eastAsiaTheme="majorEastAsia" w:cstheme="majorBidi"/>
+      <w:color w:val="0F4761" w:themeColor="accent1" w:themeShade="BF"/>
+      <w:sz w:val="28"/>
+      <w:szCs w:val="28"/>
+    </w:rPr>
+  </w:style>
+  <w:style w:type="character" w:customStyle="1" w:styleId="Heading4Char">
+    <w:name w:val="Heading 4 Char"/>
+    <w:basedOn w:val="DefaultParagraphFont"/>
+    <w:link w:val="Heading4"/>
+    <w:uiPriority w:val="9"/>
+    <w:semiHidden/>
+    <w:rsid w:val="00A10FD9"/>
+    <w:rPr>
+      <w:rFonts w:eastAsiaTheme="majorEastAsia" w:cstheme="majorBidi"/>
+      <w:i/>
+      <w:iCs/>
+      <w:color w:val="0F4761" w:themeColor="accent1" w:themeShade="BF"/>
+    </w:rPr>
+  </w:style>
+  <w:style w:type="character" w:customStyle="1" w:styleId="Heading5Char">
+    <w:name w:val="Heading 5 Char"/>
+    <w:basedOn w:val="DefaultParagraphFont"/>
+    <w:link w:val="Heading5"/>
+    <w:uiPriority w:val="9"/>
+    <w:semiHidden/>
+    <w:rsid w:val="00A10FD9"/>
+    <w:rPr>
+      <w:rFonts w:eastAsiaTheme="majorEastAsia" w:cstheme="majorBidi"/>
+      <w:color w:val="0F4761" w:themeColor="accent1" w:themeShade="BF"/>
+    </w:rPr>
+  </w:style>
+  <w:style w:type="character" w:customStyle="1" w:styleId="Heading6Char">
+    <w:name w:val="Heading 6 Char"/>
+    <w:basedOn w:val="DefaultParagraphFont"/>
+    <w:link w:val="Heading6"/>
+    <w:uiPriority w:val="9"/>
+    <w:semiHidden/>
+    <w:rsid w:val="00A10FD9"/>
+    <w:rPr>
+      <w:rFonts w:eastAsiaTheme="majorEastAsia" w:cstheme="majorBidi"/>
+      <w:i/>
+      <w:iCs/>
+      <w:color w:val="595959" w:themeColor="text1" w:themeTint="A6"/>
+    </w:rPr>
+  </w:style>
+  <w:style w:type="character" w:customStyle="1" w:styleId="Heading7Char">
+    <w:name w:val="Heading 7 Char"/>
+    <w:basedOn w:val="DefaultParagraphFont"/>
+    <w:link w:val="Heading7"/>
+    <w:uiPriority w:val="9"/>
+    <w:semiHidden/>
+    <w:rsid w:val="00A10FD9"/>
+    <w:rPr>
+      <w:rFonts w:eastAsiaTheme="majorEastAsia" w:cstheme="majorBidi"/>
+      <w:color w:val="595959" w:themeColor="text1" w:themeTint="A6"/>
+    </w:rPr>
+  </w:style>
+  <w:style w:type="character" w:customStyle="1" w:styleId="Heading8Char">
+    <w:name w:val="Heading 8 Char"/>
+    <w:basedOn w:val="DefaultParagraphFont"/>
+    <w:link w:val="Heading8"/>
+    <w:uiPriority w:val="9"/>
+    <w:semiHidden/>
+    <w:rsid w:val="00A10FD9"/>
+    <w:rPr>
+      <w:rFonts w:eastAsiaTheme="majorEastAsia" w:cstheme="majorBidi"/>
+      <w:i/>
+      <w:iCs/>
+      <w:color w:val="272727" w:themeColor="text1" w:themeTint="D8"/>
+    </w:rPr>
+  </w:style>
+  <w:style w:type="character" w:customStyle="1" w:styleId="Heading9Char">
+    <w:name w:val="Heading 9 Char"/>
+    <w:basedOn w:val="DefaultParagraphFont"/>
+    <w:link w:val="Heading9"/>
+    <w:uiPriority w:val="9"/>
+    <w:semiHidden/>
+    <w:rsid w:val="00A10FD9"/>
+    <w:rPr>
+      <w:rFonts w:eastAsiaTheme="majorEastAsia" w:cstheme="majorBidi"/>
+      <w:color w:val="272727" w:themeColor="text1" w:themeTint="D8"/>
+    </w:rPr>
+  </w:style>
+  <w:style w:type="paragraph" w:customStyle="1" w:styleId="ListItem">
+    <w:name w:val="List Item"/>
+    <w:basedOn w:val="BodyText"/>
+    <w:qFormat/>
+    <w:pPr>
+      <w:spacing w:before="0" w:after="0" w:line="480" w:lineRule="exact"/>
+      <w:ind w:left="720" w:hanging="720"/>
+    </w:pPr>
+  </w:style>
+  <w:style w:type="paragraph" w:styleId="BlockText">
+    <w:name w:val="Block Text"/>
+    <w:basedOn w:val="BodyText"/>
+    <w:next w:val="BodyText"/>
+    <w:qFormat/>
+    <w:pPr>
+      <w:spacing w:before="120" w:after="240" w:line="280" w:lineRule="exact"/>
+      <w:ind w:left="1080" w:right="1080" w:firstLine="0"/>
+    </w:pPr>
+  </w:style>
+  <w:style w:type="paragraph" w:styleId="FootnoteText">
+    <w:name w:val="Footnote Text"/>
+    <w:basedOn w:val="Normal"/>
+    <w:next w:val="FootnoteText"/>
+    <w:uiPriority w:val="9"/>
+    <w:unhideWhenUsed/>
+    <w:qFormat/>
+    <w:pPr>
+      <w:keepLines/>
+      <w:spacing w:before="0" w:after="140" w:line="280" w:lineRule="exact"/>
+    </w:pPr>
+    <w:rPr>
+      <w:sz w:val="24"/>
+      <w:szCs w:val="24"/>
+    </w:rPr>
+  </w:style>
+  <w:style w:type="paragraph" w:styleId="FootnoteBlockText">
+    <w:name w:val="Footnote Block Text"/>
+    <w:basedOn w:val="FootnoteText"/>
+    <w:next w:val="FootnoteText"/>
+    <w:uiPriority w:val="9"/>
+    <w:unhideWhenUsed/>
+    <w:qFormat/>
+    <w:pPr>
+      <w:spacing w:before="120" w:after="120"/>
+      <w:ind w:firstLine="0" w:left="720" w:right="720"/>
+    </w:pPr>
   </w:style>
   <w:style w:type="character" w:default="1" w:styleId="DefaultParagraphFont">
     <w:name w:val="Default Paragraph Font"/>
-    <w:uiPriority w:val="1"/>
     <w:semiHidden/>
     <w:unhideWhenUsed/>
   </w:style>
-  <w:style w:type="table" w:default="1" w:styleId="TableNormal">
-    <w:name w:val="Normal Table"/>
-    <w:uiPriority w:val="99"/>
-    <w:semiHidden/>
-    <w:unhideWhenUsed/>
+  <w:style w:type="table" w:default="1" w:styleId="Table">
+    <w:name w:val="Table"/>
+    <w:basedOn w:val="TableNormal"/>
+    <w:qFormat/>
     <w:tblPr>
       <w:tblInd w:w="0" w:type="dxa"/>
       <w:tblCellMar>
@@ -1444,130 +2631,112 @@
         <w:right w:w="108" w:type="dxa"/>
       </w:tblCellMar>
     </w:tblPr>
-  </w:style>
-  <w:style w:type="numbering" w:default="1" w:styleId="NoList">
-    <w:name w:val="No List"/>
-    <w:uiPriority w:val="99"/>
-    <w:semiHidden/>
-    <w:unhideWhenUsed/>
-  </w:style>
-  <w:style w:type="paragraph" w:styleId="BodyText">
-    <w:name w:val="Body Text"/>
+    <w:tblStylePr w:type="firstRow">
+      <w:tcPr>
+        <w:tcBorders>
+          <w:bottom w:val="single"/>
+        </w:tcBorders>
+        <w:vAlign w:val="bottom"/>
+      </w:tcPr>
+    </w:tblStylePr>
+  </w:style>
+  <w:style w:type="paragraph" w:customStyle="1" w:styleId="DefinitionTerm">
+    <w:name w:val="Definition Term"/>
     <w:basedOn w:val="Normal"/>
-    <w:qFormat/>
-    <w:pPr>
-      <w:spacing w:before="0" w:after="0" w:line="480" w:lineRule="exact"/>
-    </w:pPr>
-  </w:style>
-  <w:style w:type="paragraph" w:styleId="FirstParagraph">
-    <w:name w:val="First Paragraph"/>
-    <w:basedOn w:val="BodyText"/>
-    <w:next w:val="BodyText"/>
-    <w:qFormat/>
-  </w:style>
-  <w:style w:type="paragraph" w:styleId="Compact">
-    <w:name w:val="Compact"/>
-    <w:basedOn w:val="BodyText"/>
-    <w:qFormat/>
-    <w:pPr>
-      <w:spacing w:before="0" w:after="0" w:line="240" w:lineRule="auto"/>
-    </w:pPr>
-  </w:style>
-  <w:style w:type="paragraph" w:styleId="Heading1">
-    <w:name w:val="heading 1"/>
-    <w:basedOn w:val="Normal"/>
-    <w:next w:val="BodyText"/>
-    <w:uiPriority w:val="9"/>
-    <w:qFormat/>
+    <w:next w:val="Definition"/>
     <w:pPr>
       <w:keepNext/>
       <w:keepLines/>
-      <w:spacing w:before="240" w:after="240" w:line="240" w:lineRule="auto"/>
-      <w:jc w:val="center"/>
-      <w:outlineLvl w:val="0"/>
+      <w:spacing w:after="0"/>
     </w:pPr>
     <w:rPr>
       <w:b/>
-      <w:bCs/>
-      <w:caps/>
+    </w:rPr>
+  </w:style>
+  <w:style w:type="paragraph" w:customStyle="1" w:styleId="Definition">
+    <w:name w:val="Definition"/>
+    <w:basedOn w:val="Normal"/>
+  </w:style>
+  <w:style w:type="paragraph" w:styleId="Caption">
+    <w:name w:val="Caption"/>
+    <w:basedOn w:val="Normal"/>
+    <w:link w:val="BodyTextChar"/>
+    <w:pPr>
+      <w:spacing w:before="0" w:after="120"/>
+    </w:pPr>
+    <w:rPr>
+      <w:i/>
+    </w:rPr>
+  </w:style>
+  <w:style w:type="paragraph" w:customStyle="1" w:styleId="TableCaption">
+    <w:name w:val="Table Caption"/>
+    <w:basedOn w:val="Caption"/>
+    <w:pPr>
+      <w:keepNext/>
+    </w:pPr>
+  </w:style>
+  <w:style w:type="paragraph" w:customStyle="1" w:styleId="ImageCaption">
+    <w:name w:val="Image Caption"/>
+    <w:basedOn w:val="Caption"/>
+  </w:style>
+  <w:style w:type="paragraph" w:customStyle="1" w:styleId="Figure">
+    <w:name w:val="Figure"/>
+    <w:basedOn w:val="Normal"/>
+  </w:style>
+  <w:style w:type="paragraph" w:customStyle="1" w:styleId="CaptionedFigure">
+    <w:name w:val="Captioned Figure"/>
+    <w:basedOn w:val="Figure"/>
+    <w:pPr>
+      <w:keepNext/>
+    </w:pPr>
+  </w:style>
+  <w:style w:type="character" w:customStyle="1" w:styleId="BodyTextChar">
+    <w:name w:val="Body Text Char"/>
+    <w:basedOn w:val="DefaultParagraphFont"/>
+    <w:link w:val="BodyText"/>
+  </w:style>
+  <w:style w:type="character" w:customStyle="1" w:styleId="VerbatimChar">
+    <w:name w:val="Verbatim Char"/>
+    <w:basedOn w:val="BodyTextChar"/>
+    <w:rPr>
+      <w:rFonts w:ascii="Consolas" w:hAnsi="Consolas"/>
+      <w:sz w:val="22"/>
+    </w:rPr>
+  </w:style>
+  <w:style w:type="character" w:customStyle="1" w:styleId="SectionNumber">
+    <w:name w:val="Section Number"/>
+    <w:basedOn w:val="BodyTextChar"/>
+  </w:style>
+  <w:style w:type="character" w:styleId="FootnoteReference">
+    <w:name w:val="Footnote Reference"/>
+    <w:basedOn w:val="BodyTextChar"/>
+    <w:rPr>
+      <w:vertAlign w:val="superscript"/>
+    </w:rPr>
+  </w:style>
+  <w:style w:type="character" w:styleId="Hyperlink">
+    <w:name w:val="Hyperlink"/>
+    <w:basedOn w:val="BodyTextChar"/>
+    <w:rPr>
       <w:color w:val="000000"/>
     </w:rPr>
   </w:style>
-  <w:style w:type="paragraph" w:styleId="Heading2">
-    <w:name w:val="heading 2"/>
-    <w:basedOn w:val="Normal"/>
+  <w:style w:type="paragraph" w:styleId="TOCHeading">
+    <w:name w:val="TOC Heading"/>
+    <w:basedOn w:val="Heading1"/>
     <w:next w:val="BodyText"/>
-    <w:uiPriority w:val="9"/>
+    <w:uiPriority w:val="39"/>
     <w:unhideWhenUsed/>
     <w:qFormat/>
     <w:pPr>
-      <w:keepNext/>
-      <w:keepLines/>
-      <w:spacing w:before="240" w:after="240" w:line="240" w:lineRule="auto"/>
-      <w:ind w:left="720" w:hanging="720"/>
-      <w:outlineLvl w:val="1"/>
+      <w:spacing w:before="240" w:line="259" w:lineRule="auto"/>
+      <w:outlineLvl w:val="9"/>
     </w:pPr>
     <w:rPr>
-      <w:b/>
-      <w:bCs/>
-      <w:color w:val="000000"/>
-    </w:rPr>
-  </w:style>
-  <w:style w:type="paragraph" w:styleId="Heading3">
-    <w:name w:val="heading 3"/>
-    <w:basedOn w:val="Normal"/>
-    <w:next w:val="BodyText"/>
-    <w:uiPriority w:val="9"/>
-    <w:unhideWhenUsed/>
-    <w:qFormat/>
-    <w:pPr>
-      <w:keepNext/>
-      <w:keepLines/>
-      <w:spacing w:before="240" w:after="240" w:line="240" w:lineRule="auto"/>
-      <w:outlineLvl w:val="2"/>
-    </w:pPr>
-    <w:rPr>
-      <w:b/>
-      <w:bCs/>
-      <w:i/>
-      <w:iCs/>
-      <w:color w:val="000000"/>
-    </w:rPr>
-  </w:style>
-  <w:style w:type="paragraph" w:styleId="BlockText">
-    <w:name w:val="Block Text"/>
-    <w:basedOn w:val="Normal"/>
-    <w:next w:val="BodyText"/>
-    <w:uiPriority w:val="9"/>
-    <w:unhideWhenUsed/>
-    <w:qFormat/>
-    <w:pPr>
-      <w:spacing w:before="120" w:after="240" w:line="240" w:lineRule="auto"/>
-      <w:ind w:left="1080" w:right="1080"/>
-      <w:jc w:val="both"/>
-    </w:pPr>
-  </w:style>
-  <w:style w:type="paragraph" w:styleId="FootnoteText">
-    <w:name w:val="footnote text"/>
-    <w:basedOn w:val="Normal"/>
-    <w:uiPriority w:val="99"/>
-    <w:unhideWhenUsed/>
-    <w:pPr>
-      <w:spacing w:before="0" w:after="60" w:line="240" w:lineRule="auto"/>
-      <w:jc w:val="both"/>
-    </w:pPr>
-    <w:rPr>
-      <w:sz w:val="20"/>
-      <w:szCs w:val="20"/>
-    </w:rPr>
-  </w:style>
-  <w:style w:type="character" w:styleId="FootnoteReference">
-    <w:name w:val="footnote reference"/>
-    <w:basedOn w:val="DefaultParagraphFont"/>
-    <w:uiPriority w:val="99"/>
-    <w:unhideWhenUsed/>
-    <w:rPr>
-      <w:vertAlign w:val="superscript"/>
+      <w:rFonts w:asciiTheme="majorHAnsi" w:eastAsiaTheme="majorEastAsia" w:hAnsiTheme="majorHAnsi" w:cstheme="majorBidi"/>
+      <w:b w:val="0"/>
+      <w:bCs w:val="0"/>
+      <w:color w:val="365F91" w:themeColor="accent1" w:themeShade="BF"/>
     </w:rPr>
   </w:style>
   <w:style w:type="paragraph" w:customStyle="1" w:styleId="NumberedParagraph">
@@ -1576,17 +2745,8 @@
     <w:qFormat/>
     <w:pPr>
       <w:tabs>
-        <w:tab w:val="left" w:pos="1080"/>
+        <w:tab w:val="left" w:pos="1440"/>
       </w:tabs>
-      <w:spacing w:before="0" w:after="0" w:line="480" w:lineRule="exact"/>
-      <w:ind w:firstLine="720"/>
-    </w:pPr>
-  </w:style>
-  <w:style w:type="paragraph" w:customStyle="1" w:styleId="IndentedParagraph">
-    <w:name w:val="Indented Paragraph"/>
-    <w:basedOn w:val="BodyText"/>
-    <w:qFormat/>
-    <w:pPr>
       <w:spacing w:before="0" w:after="0" w:line="480" w:lineRule="exact"/>
       <w:ind w:firstLine="720"/>
     </w:pPr>
@@ -1602,52 +2762,6 @@
       <w:spacing w:before="0" w:after="0" w:line="480" w:lineRule="exact"/>
       <w:ind w:left="1296" w:hanging="576"/>
     </w:pPr>
-  </w:style>
-  <w:style w:type="paragraph" w:customStyle="1" w:styleId="SingleSpaced">
-    <w:name w:val="Single Spaced"/>
-    <w:basedOn w:val="Normal"/>
-    <w:qFormat/>
-    <w:pPr>
-      <w:spacing w:before="0" w:after="120" w:line="240" w:lineRule="auto"/>
-    </w:pPr>
-  </w:style>
-  <w:style w:type="paragraph" w:customStyle="1" w:styleId="CourtName">
-    <w:name w:val="Court Name"/>
-    <w:basedOn w:val="Normal"/>
-    <w:qFormat/>
-    <w:pPr>
-      <w:spacing w:before="0" w:after="0" w:line="240" w:lineRule="auto"/>
-      <w:jc w:val="center"/>
-    </w:pPr>
-    <w:rPr>
-      <w:b/>
-      <w:bCs/>
-    </w:rPr>
-  </w:style>
-  <w:style w:type="table" w:styleId="Table">
-    <w:name w:val="Table"/>
-    <w:basedOn w:val="TableNormal"/>
-    <w:uiPriority w:val="59"/>
-    <w:pPr>
-      <w:spacing w:before="0" w:after="0" w:line="240" w:lineRule="auto"/>
-    </w:pPr>
-    <w:tblPr>
-      <w:tblInd w:w="720" w:type="dxa"/>
-      <w:tblBorders>
-        <w:top w:val="single" w:sz="4" w:space="0" w:color="000000"/>
-        <w:left w:val="single" w:sz="4" w:space="0" w:color="000000"/>
-        <w:bottom w:val="single" w:sz="4" w:space="0" w:color="000000"/>
-        <w:right w:val="single" w:sz="4" w:space="0" w:color="000000"/>
-        <w:insideH w:val="single" w:sz="4" w:space="0" w:color="000000"/>
-        <w:insideV w:val="single" w:sz="4" w:space="0" w:color="000000"/>
-      </w:tblBorders>
-      <w:tblCellMar>
-        <w:top w:w="29" w:type="dxa"/>
-        <w:left w:w="108" w:type="dxa"/>
-        <w:bottom w:w="29" w:type="dxa"/>
-        <w:right w:w="108" w:type="dxa"/>
-      </w:tblCellMar>
-    </w:tblPr>
   </w:style>
   <w:style w:type="paragraph" w:customStyle="1" w:styleId="SourceCode">
     <w:name w:val="Source Code"/>

</xml_diff>